<commit_message>
Some buttons styles were added
</commit_message>
<xml_diff>
--- a/STRWEB/LR4/LR4 СТРВП (1).docx
+++ b/STRWEB/LR4/LR4 СТРВП (1).docx
@@ -1,6 +1,6 @@
 
 <file path=word/document.xml><?xml version="1.0" encoding="utf-8"?>
-<w:document xmlns:wpc="http://schemas.microsoft.com/office/word/2010/wordprocessingCanvas" xmlns:mc="http://schemas.openxmlformats.org/markup-compatibility/2006" xmlns:o="urn:schemas-microsoft-com:office:office" xmlns:r="http://schemas.openxmlformats.org/officeDocument/2006/relationships" xmlns:m="http://schemas.openxmlformats.org/officeDocument/2006/math" xmlns:v="urn:schemas-microsoft-com:vml" xmlns:wp14="http://schemas.microsoft.com/office/word/2010/wordprocessingDrawing" xmlns:wp="http://schemas.openxmlformats.org/drawingml/2006/wordprocessingDrawing" xmlns:w10="urn:schemas-microsoft-com:office:word" xmlns:w="http://schemas.openxmlformats.org/wordprocessingml/2006/main" xmlns:w14="http://schemas.microsoft.com/office/word/2010/wordml" xmlns:w15="http://schemas.microsoft.com/office/word/2012/wordml" xmlns:wpg="http://schemas.microsoft.com/office/word/2010/wordprocessingGroup" xmlns:wpi="http://schemas.microsoft.com/office/word/2010/wordprocessingInk" xmlns:wne="http://schemas.microsoft.com/office/word/2006/wordml" xmlns:wps="http://schemas.microsoft.com/office/word/2010/wordprocessingShape" mc:Ignorable="w14 w15 wp14">
+<w:document xmlns:wpc="http://schemas.microsoft.com/office/word/2010/wordprocessingCanvas" xmlns:cx="http://schemas.microsoft.com/office/drawing/2014/chartex" xmlns:mc="http://schemas.openxmlformats.org/markup-compatibility/2006" xmlns:o="urn:schemas-microsoft-com:office:office" xmlns:r="http://schemas.openxmlformats.org/officeDocument/2006/relationships" xmlns:m="http://schemas.openxmlformats.org/officeDocument/2006/math" xmlns:v="urn:schemas-microsoft-com:vml" xmlns:wp14="http://schemas.microsoft.com/office/word/2010/wordprocessingDrawing" xmlns:wp="http://schemas.openxmlformats.org/drawingml/2006/wordprocessingDrawing" xmlns:w10="urn:schemas-microsoft-com:office:word" xmlns:w="http://schemas.openxmlformats.org/wordprocessingml/2006/main" xmlns:w14="http://schemas.microsoft.com/office/word/2010/wordml" xmlns:w15="http://schemas.microsoft.com/office/word/2012/wordml" xmlns:w16se="http://schemas.microsoft.com/office/word/2015/wordml/symex" xmlns:wpg="http://schemas.microsoft.com/office/word/2010/wordprocessingGroup" xmlns:wpi="http://schemas.microsoft.com/office/word/2010/wordprocessingInk" xmlns:wne="http://schemas.microsoft.com/office/word/2006/wordml" xmlns:wps="http://schemas.microsoft.com/office/word/2010/wordprocessingShape" mc:Ignorable="w14 w15 w16se wp14">
   <w:body>
     <w:p>
       <w:pPr>
@@ -382,58 +382,16 @@
         </w:rPr>
         <w:t xml:space="preserve">Пример: </w:t>
       </w:r>
-      <w:bookmarkStart w:id="0" w:name="_GoBack"/>
-      <w:bookmarkEnd w:id="0"/>
-      <w:r>
-        <w:rPr>
-          <w:sz w:val="28"/>
-          <w:szCs w:val="28"/>
-        </w:rPr>
-        <w:fldChar w:fldCharType="begin"/>
-      </w:r>
-      <w:r>
-        <w:rPr>
-          <w:sz w:val="28"/>
-          <w:szCs w:val="28"/>
-        </w:rPr>
-        <w:instrText xml:space="preserve"> HYPERLINK "</w:instrText>
-      </w:r>
-      <w:r>
-        <w:rPr>
-          <w:sz w:val="28"/>
-          <w:szCs w:val="28"/>
-        </w:rPr>
-        <w:instrText>https://www.bezkoder.com/react-node-express-mongodb-mern-stack/</w:instrText>
-      </w:r>
-      <w:r>
-        <w:rPr>
-          <w:sz w:val="28"/>
-          <w:szCs w:val="28"/>
-        </w:rPr>
-        <w:instrText xml:space="preserve">" </w:instrText>
-      </w:r>
-      <w:r>
-        <w:rPr>
-          <w:sz w:val="28"/>
-          <w:szCs w:val="28"/>
-        </w:rPr>
-        <w:fldChar w:fldCharType="separate"/>
-      </w:r>
-      <w:r>
-        <w:rPr>
-          <w:rStyle w:val="a6"/>
-          <w:sz w:val="28"/>
-          <w:szCs w:val="28"/>
-        </w:rPr>
-        <w:t>https://www.bezkoder.com/react-node-express-mongodb-mern-stack/</w:t>
-      </w:r>
-      <w:r>
-        <w:rPr>
-          <w:sz w:val="28"/>
-          <w:szCs w:val="28"/>
-        </w:rPr>
-        <w:fldChar w:fldCharType="end"/>
-      </w:r>
+      <w:hyperlink r:id="rId7" w:history="1">
+        <w:r>
+          <w:rPr>
+            <w:rStyle w:val="a6"/>
+            <w:sz w:val="28"/>
+            <w:szCs w:val="28"/>
+          </w:rPr>
+          <w:t>https://www.bezkoder.com/react-node-express-mongodb-mern-stack/</w:t>
+        </w:r>
+      </w:hyperlink>
       <w:r>
         <w:rPr>
           <w:sz w:val="28"/>
@@ -512,7 +470,7 @@
       <w:r>
         <w:t xml:space="preserve">Документация: </w:t>
       </w:r>
-      <w:hyperlink r:id="rId7" w:history="1">
+      <w:hyperlink r:id="rId8" w:history="1">
         <w:r>
           <w:rPr>
             <w:rStyle w:val="a6"/>
@@ -535,7 +493,7 @@
         </w:rPr>
         <w:t xml:space="preserve">, </w:t>
       </w:r>
-      <w:hyperlink r:id="rId8" w:history="1">
+      <w:hyperlink r:id="rId9" w:history="1">
         <w:r>
           <w:rPr>
             <w:rStyle w:val="a6"/>
@@ -559,7 +517,7 @@
       <w:pPr>
         <w:jc w:val="both"/>
       </w:pPr>
-      <w:hyperlink r:id="rId9" w:history="1">
+      <w:hyperlink r:id="rId10" w:history="1">
         <w:r>
           <w:rPr>
             <w:rStyle w:val="a6"/>
@@ -593,8 +551,8 @@
           <w:lang w:val="en-US"/>
         </w:rPr>
       </w:pPr>
-      <w:hyperlink r:id="rId10" w:history="1"/>
-      <w:hyperlink r:id="rId11" w:history="1">
+      <w:hyperlink r:id="rId11" w:history="1"/>
+      <w:hyperlink r:id="rId12" w:history="1">
         <w:r>
           <w:rPr>
             <w:rStyle w:val="a6"/>
@@ -608,19 +566,12 @@
       <w:pPr>
         <w:jc w:val="both"/>
       </w:pPr>
-      <w:hyperlink r:id="rId12" w:history="1">
+      <w:hyperlink r:id="rId13" w:history="1">
         <w:r>
           <w:rPr>
             <w:rStyle w:val="a6"/>
           </w:rPr>
-          <w:t xml:space="preserve">Быстрый </w:t>
-        </w:r>
-        <w:proofErr w:type="gramStart"/>
-        <w:r>
-          <w:rPr>
-            <w:rStyle w:val="a6"/>
-          </w:rPr>
-          <w:t xml:space="preserve">старт  </w:t>
+          <w:t xml:space="preserve">Быстрый старт  </w:t>
         </w:r>
         <w:proofErr w:type="spellStart"/>
         <w:r>
@@ -630,7 +581,6 @@
           <w:t>React</w:t>
         </w:r>
         <w:proofErr w:type="spellEnd"/>
-        <w:proofErr w:type="gramEnd"/>
         <w:r>
           <w:rPr>
             <w:rStyle w:val="a6"/>
@@ -646,15 +596,38 @@
           <w:lang w:val="en-US"/>
         </w:rPr>
       </w:pPr>
-      <w:hyperlink r:id="rId13" w:history="1">
-        <w:r>
-          <w:rPr>
-            <w:rStyle w:val="a6"/>
-            <w:lang w:val="en-US"/>
-          </w:rPr>
-          <w:t>React Reference Overview – React</w:t>
-        </w:r>
-      </w:hyperlink>
+      <w:r>
+        <w:fldChar w:fldCharType="begin"/>
+      </w:r>
+      <w:r>
+        <w:rPr>
+          <w:lang w:val="en-US"/>
+        </w:rPr>
+        <w:instrText xml:space="preserve"> HYPERLINK "https://reac</w:instrText>
+      </w:r>
+      <w:r>
+        <w:rPr>
+          <w:lang w:val="en-US"/>
+        </w:rPr>
+        <w:instrText xml:space="preserve">t.dev/reference/react" </w:instrText>
+      </w:r>
+      <w:r>
+        <w:fldChar w:fldCharType="separate"/>
+      </w:r>
+      <w:r>
+        <w:rPr>
+          <w:rStyle w:val="a6"/>
+          <w:lang w:val="en-US"/>
+        </w:rPr>
+        <w:t>React Reference Overview – React</w:t>
+      </w:r>
+      <w:r>
+        <w:rPr>
+          <w:rStyle w:val="a6"/>
+          <w:lang w:val="en-US"/>
+        </w:rPr>
+        <w:fldChar w:fldCharType="end"/>
+      </w:r>
     </w:p>
     <w:p>
       <w:pPr>
@@ -663,396 +636,481 @@
           <w:lang w:val="en-US"/>
         </w:rPr>
       </w:pPr>
+      <w:r>
+        <w:fldChar w:fldCharType="begin"/>
+      </w:r>
+      <w:r>
+        <w:rPr>
+          <w:lang w:val="en-US"/>
+        </w:rPr>
+        <w:instrText xml:space="preserve"> HYPERLINK "https://learn.microsoft.com/ru-ru/windows/dev-environment/javascript/react-beginners-tutorial" </w:instrText>
+      </w:r>
+      <w:r>
+        <w:fldChar w:fldCharType="separate"/>
+      </w:r>
+      <w:r>
+        <w:rPr>
+          <w:rStyle w:val="a6"/>
+        </w:rPr>
+        <w:t>Учебник</w:t>
+      </w:r>
+      <w:r>
+        <w:rPr>
+          <w:rStyle w:val="a6"/>
+          <w:lang w:val="en-US"/>
+        </w:rPr>
+        <w:t>. React</w:t>
+      </w:r>
+      <w:r>
+        <w:rPr>
+          <w:rStyle w:val="a6"/>
+          <w:lang w:val="en-US"/>
+        </w:rPr>
+        <w:t xml:space="preserve"> </w:t>
+      </w:r>
+      <w:r>
+        <w:rPr>
+          <w:rStyle w:val="a6"/>
+        </w:rPr>
+        <w:t>для</w:t>
+      </w:r>
+      <w:r>
+        <w:rPr>
+          <w:rStyle w:val="a6"/>
+          <w:lang w:val="en-US"/>
+        </w:rPr>
+        <w:t xml:space="preserve"> </w:t>
+      </w:r>
+      <w:r>
+        <w:rPr>
+          <w:rStyle w:val="a6"/>
+        </w:rPr>
+        <w:t>начинающих</w:t>
+      </w:r>
+      <w:r>
+        <w:rPr>
+          <w:rStyle w:val="a6"/>
+          <w:lang w:val="en-US"/>
+        </w:rPr>
+        <w:t xml:space="preserve"> | </w:t>
+      </w:r>
+      <w:r>
+        <w:rPr>
+          <w:rStyle w:val="a6"/>
+          <w:lang w:val="en-US"/>
+        </w:rPr>
+        <w:t>Microsoft</w:t>
+      </w:r>
+      <w:r>
+        <w:rPr>
+          <w:rStyle w:val="a6"/>
+          <w:lang w:val="en-US"/>
+        </w:rPr>
+        <w:t xml:space="preserve"> </w:t>
+      </w:r>
+      <w:r>
+        <w:rPr>
+          <w:rStyle w:val="a6"/>
+          <w:lang w:val="en-US"/>
+        </w:rPr>
+        <w:t>Learn</w:t>
+      </w:r>
+      <w:r>
+        <w:rPr>
+          <w:rStyle w:val="a6"/>
+          <w:lang w:val="en-US"/>
+        </w:rPr>
+        <w:fldChar w:fldCharType="end"/>
+      </w:r>
+      <w:r>
+        <w:rPr>
+          <w:lang w:val="en-US"/>
+        </w:rPr>
+        <w:t xml:space="preserve"> </w:t>
+      </w:r>
+    </w:p>
+    <w:p>
+      <w:pPr>
+        <w:jc w:val="both"/>
+        <w:rPr>
+          <w:b/>
+          <w:sz w:val="28"/>
+          <w:szCs w:val="28"/>
+          <w:lang w:val="en-US"/>
+        </w:rPr>
+      </w:pPr>
+    </w:p>
+    <w:p>
+      <w:pPr>
+        <w:jc w:val="both"/>
+        <w:rPr>
+          <w:b/>
+          <w:sz w:val="28"/>
+          <w:szCs w:val="28"/>
+          <w:lang w:val="en-US"/>
+        </w:rPr>
+      </w:pPr>
+      <w:r>
+        <w:rPr>
+          <w:b/>
+          <w:sz w:val="28"/>
+          <w:szCs w:val="28"/>
+          <w:lang w:val="en-US"/>
+        </w:rPr>
+        <w:t>C</w:t>
+      </w:r>
+      <w:proofErr w:type="spellStart"/>
+      <w:r>
+        <w:rPr>
+          <w:b/>
+          <w:sz w:val="28"/>
+          <w:szCs w:val="28"/>
+        </w:rPr>
+        <w:t>правочная</w:t>
+      </w:r>
+      <w:proofErr w:type="spellEnd"/>
+      <w:r>
+        <w:rPr>
+          <w:b/>
+          <w:sz w:val="28"/>
+          <w:szCs w:val="28"/>
+          <w:lang w:val="en-US"/>
+        </w:rPr>
+        <w:t xml:space="preserve"> </w:t>
+      </w:r>
+      <w:r>
+        <w:rPr>
+          <w:b/>
+          <w:sz w:val="28"/>
+          <w:szCs w:val="28"/>
+        </w:rPr>
+        <w:t>информация</w:t>
+      </w:r>
+      <w:r>
+        <w:rPr>
+          <w:b/>
+          <w:sz w:val="28"/>
+          <w:szCs w:val="28"/>
+          <w:lang w:val="en-US"/>
+        </w:rPr>
+        <w:t xml:space="preserve"> </w:t>
+      </w:r>
+      <w:r>
+        <w:rPr>
+          <w:b/>
+          <w:sz w:val="28"/>
+          <w:szCs w:val="28"/>
+        </w:rPr>
+        <w:t>по</w:t>
+      </w:r>
+      <w:r>
+        <w:rPr>
+          <w:b/>
+          <w:sz w:val="28"/>
+          <w:szCs w:val="28"/>
+          <w:lang w:val="en-US"/>
+        </w:rPr>
+        <w:t xml:space="preserve"> </w:t>
+      </w:r>
+      <w:r>
+        <w:rPr>
+          <w:b/>
+          <w:sz w:val="28"/>
+          <w:szCs w:val="28"/>
+          <w:lang w:val="en-US"/>
+        </w:rPr>
+        <w:t>Node</w:t>
+      </w:r>
+      <w:r>
+        <w:rPr>
+          <w:b/>
+          <w:sz w:val="28"/>
+          <w:szCs w:val="28"/>
+          <w:lang w:val="en-US"/>
+        </w:rPr>
+        <w:t>.</w:t>
+      </w:r>
+      <w:r>
+        <w:rPr>
+          <w:b/>
+          <w:sz w:val="28"/>
+          <w:szCs w:val="28"/>
+          <w:lang w:val="en-US"/>
+        </w:rPr>
+        <w:t>js</w:t>
+      </w:r>
+      <w:r>
+        <w:rPr>
+          <w:b/>
+          <w:sz w:val="28"/>
+          <w:szCs w:val="28"/>
+          <w:lang w:val="en-US"/>
+        </w:rPr>
+        <w:t>/</w:t>
+      </w:r>
+      <w:r>
+        <w:rPr>
+          <w:sz w:val="28"/>
+          <w:szCs w:val="28"/>
+          <w:lang w:val="en-US"/>
+        </w:rPr>
+        <w:t xml:space="preserve"> </w:t>
+      </w:r>
+      <w:r>
+        <w:rPr>
+          <w:b/>
+          <w:sz w:val="28"/>
+          <w:szCs w:val="28"/>
+          <w:lang w:val="en-US"/>
+        </w:rPr>
+        <w:t>Express</w:t>
+      </w:r>
+      <w:r>
+        <w:rPr>
+          <w:b/>
+          <w:sz w:val="28"/>
+          <w:szCs w:val="28"/>
+          <w:lang w:val="en-US"/>
+        </w:rPr>
+        <w:t>:</w:t>
+      </w:r>
+    </w:p>
+    <w:p>
+      <w:pPr>
+        <w:jc w:val="both"/>
+        <w:rPr>
+          <w:lang w:val="en-US"/>
+        </w:rPr>
+      </w:pPr>
+      <w:r>
+        <w:fldChar w:fldCharType="begin"/>
+      </w:r>
+      <w:r>
+        <w:rPr>
+          <w:lang w:val="en-US"/>
+        </w:rPr>
+        <w:instrText xml:space="preserve"> HYPERLINK "https://developer.mozilla.org/ru/docs/Learn/Server-side/Express_Nodejs" </w:instrText>
+      </w:r>
+      <w:r>
+        <w:fldChar w:fldCharType="separate"/>
+      </w:r>
+      <w:r>
+        <w:rPr>
+          <w:rStyle w:val="a6"/>
+          <w:lang w:val="en-US"/>
+        </w:rPr>
+        <w:t>https://developer.mozilla.org/ru/docs/Learn/Server-side/Express_Nodejs</w:t>
+      </w:r>
+      <w:r>
+        <w:rPr>
+          <w:rStyle w:val="a6"/>
+          <w:lang w:val="en-US"/>
+        </w:rPr>
+        <w:fldChar w:fldCharType="end"/>
+      </w:r>
+      <w:r>
+        <w:rPr>
+          <w:lang w:val="en-US"/>
+        </w:rPr>
+        <w:t xml:space="preserve"> </w:t>
+      </w:r>
+    </w:p>
+    <w:p>
+      <w:pPr>
+        <w:jc w:val="both"/>
+        <w:rPr>
+          <w:lang w:val="en-US"/>
+        </w:rPr>
+      </w:pPr>
+      <w:r>
+        <w:fldChar w:fldCharType="begin"/>
+      </w:r>
+      <w:r>
+        <w:rPr>
+          <w:lang w:val="en-US"/>
+        </w:rPr>
+        <w:instrText xml:space="preserve"> HYPERLINK "https://metanit.com/web/nodejs/1.1.php" </w:instrText>
+      </w:r>
+      <w:r>
+        <w:fldChar w:fldCharType="separate"/>
+      </w:r>
+      <w:r>
+        <w:rPr>
+          <w:rStyle w:val="a6"/>
+          <w:lang w:val="en-US"/>
+        </w:rPr>
+        <w:t xml:space="preserve">Node.JS | </w:t>
+      </w:r>
+      <w:r>
+        <w:rPr>
+          <w:rStyle w:val="a6"/>
+        </w:rPr>
+        <w:t>Введение</w:t>
+      </w:r>
+      <w:r>
+        <w:rPr>
+          <w:rStyle w:val="a6"/>
+          <w:lang w:val="en-US"/>
+        </w:rPr>
+        <w:t xml:space="preserve"> </w:t>
+      </w:r>
+      <w:r>
+        <w:rPr>
+          <w:rStyle w:val="a6"/>
+        </w:rPr>
+        <w:t>и</w:t>
+      </w:r>
+      <w:r>
+        <w:rPr>
+          <w:rStyle w:val="a6"/>
+          <w:lang w:val="en-US"/>
+        </w:rPr>
+        <w:t xml:space="preserve"> </w:t>
+      </w:r>
+      <w:r>
+        <w:rPr>
+          <w:rStyle w:val="a6"/>
+        </w:rPr>
+        <w:t>начало</w:t>
+      </w:r>
+      <w:r>
+        <w:rPr>
+          <w:rStyle w:val="a6"/>
+          <w:lang w:val="en-US"/>
+        </w:rPr>
+        <w:t xml:space="preserve"> </w:t>
+      </w:r>
+      <w:r>
+        <w:rPr>
+          <w:rStyle w:val="a6"/>
+        </w:rPr>
+        <w:t>работы</w:t>
+      </w:r>
+      <w:r>
+        <w:rPr>
+          <w:rStyle w:val="a6"/>
+          <w:lang w:val="en-US"/>
+        </w:rPr>
+        <w:t xml:space="preserve"> (metanit.com)</w:t>
+      </w:r>
+      <w:r>
+        <w:rPr>
+          <w:rStyle w:val="a6"/>
+          <w:lang w:val="en-US"/>
+        </w:rPr>
+        <w:fldChar w:fldCharType="end"/>
+      </w:r>
+      <w:r>
+        <w:rPr>
+          <w:lang w:val="en-US"/>
+        </w:rPr>
+        <w:t xml:space="preserve">      </w:t>
+      </w:r>
+      <w:r>
+        <w:fldChar w:fldCharType="begin"/>
+      </w:r>
+      <w:r>
+        <w:rPr>
+          <w:lang w:val="en-US"/>
+        </w:rPr>
+        <w:instrText xml:space="preserve"> HYPERLINK "https://metanit.com/web/nodejs/4.1.php" </w:instrText>
+      </w:r>
+      <w:r>
+        <w:fldChar w:fldCharType="separate"/>
+      </w:r>
+      <w:r>
+        <w:rPr>
+          <w:rStyle w:val="a6"/>
+          <w:lang w:val="en-US"/>
+        </w:rPr>
+        <w:t xml:space="preserve">Node.JS | </w:t>
+      </w:r>
+      <w:r>
+        <w:rPr>
+          <w:rStyle w:val="a6"/>
+        </w:rPr>
+        <w:t>Начало</w:t>
+      </w:r>
+      <w:r>
+        <w:rPr>
+          <w:rStyle w:val="a6"/>
+          <w:lang w:val="en-US"/>
+        </w:rPr>
+        <w:t xml:space="preserve"> </w:t>
+      </w:r>
+      <w:r>
+        <w:rPr>
+          <w:rStyle w:val="a6"/>
+        </w:rPr>
+        <w:t>работы</w:t>
+      </w:r>
+      <w:r>
+        <w:rPr>
+          <w:rStyle w:val="a6"/>
+          <w:lang w:val="en-US"/>
+        </w:rPr>
+        <w:t xml:space="preserve"> </w:t>
+      </w:r>
+      <w:r>
+        <w:rPr>
+          <w:rStyle w:val="a6"/>
+        </w:rPr>
+        <w:t>с</w:t>
+      </w:r>
+      <w:r>
+        <w:rPr>
+          <w:rStyle w:val="a6"/>
+          <w:lang w:val="en-US"/>
+        </w:rPr>
+        <w:t xml:space="preserve"> Express (metanit.com)</w:t>
+      </w:r>
+      <w:r>
+        <w:rPr>
+          <w:rStyle w:val="a6"/>
+          <w:lang w:val="en-US"/>
+        </w:rPr>
+        <w:fldChar w:fldCharType="end"/>
+      </w:r>
+    </w:p>
+    <w:p>
+      <w:pPr>
+        <w:jc w:val="both"/>
+        <w:rPr>
+          <w:lang w:val="en-US"/>
+        </w:rPr>
+      </w:pPr>
+      <w:r>
+        <w:fldChar w:fldCharType="begin"/>
+      </w:r>
+      <w:r>
+        <w:rPr>
+          <w:lang w:val="en-US"/>
+        </w:rPr>
+        <w:instrText xml:space="preserve"> HYPERLINK "https://direct.nodejs.org/en/docs/guides" </w:instrText>
+      </w:r>
+      <w:r>
+        <w:fldChar w:fldCharType="separate"/>
+      </w:r>
+      <w:r>
+        <w:rPr>
+          <w:rStyle w:val="a6"/>
+          <w:lang w:val="en-US"/>
+        </w:rPr>
+        <w:t>Guides | Node.js (nodejs.org)</w:t>
+      </w:r>
+      <w:r>
+        <w:rPr>
+          <w:rStyle w:val="a6"/>
+          <w:lang w:val="en-US"/>
+        </w:rPr>
+        <w:fldChar w:fldCharType="end"/>
+      </w:r>
+    </w:p>
+    <w:p>
+      <w:pPr>
+        <w:jc w:val="both"/>
+      </w:pPr>
       <w:hyperlink r:id="rId14" w:history="1">
-        <w:r>
-          <w:rPr>
-            <w:rStyle w:val="a6"/>
-          </w:rPr>
-          <w:t>Учебник</w:t>
-        </w:r>
-        <w:r>
-          <w:rPr>
-            <w:rStyle w:val="a6"/>
-            <w:lang w:val="en-US"/>
-          </w:rPr>
-          <w:t>. React</w:t>
-        </w:r>
-        <w:r>
-          <w:rPr>
-            <w:rStyle w:val="a6"/>
-            <w:lang w:val="en-US"/>
-          </w:rPr>
-          <w:t xml:space="preserve"> </w:t>
-        </w:r>
-        <w:r>
-          <w:rPr>
-            <w:rStyle w:val="a6"/>
-          </w:rPr>
-          <w:t>для</w:t>
-        </w:r>
-        <w:r>
-          <w:rPr>
-            <w:rStyle w:val="a6"/>
-            <w:lang w:val="en-US"/>
-          </w:rPr>
-          <w:t xml:space="preserve"> </w:t>
-        </w:r>
-        <w:r>
-          <w:rPr>
-            <w:rStyle w:val="a6"/>
-          </w:rPr>
-          <w:t>начинающих</w:t>
-        </w:r>
-        <w:r>
-          <w:rPr>
-            <w:rStyle w:val="a6"/>
-            <w:lang w:val="en-US"/>
-          </w:rPr>
-          <w:t xml:space="preserve"> | </w:t>
-        </w:r>
-        <w:r>
-          <w:rPr>
-            <w:rStyle w:val="a6"/>
-            <w:lang w:val="en-US"/>
-          </w:rPr>
-          <w:t>Microsoft</w:t>
-        </w:r>
-        <w:r>
-          <w:rPr>
-            <w:rStyle w:val="a6"/>
-            <w:lang w:val="en-US"/>
-          </w:rPr>
-          <w:t xml:space="preserve"> </w:t>
-        </w:r>
-        <w:r>
-          <w:rPr>
-            <w:rStyle w:val="a6"/>
-            <w:lang w:val="en-US"/>
-          </w:rPr>
-          <w:t>Learn</w:t>
-        </w:r>
-      </w:hyperlink>
-      <w:r>
-        <w:rPr>
-          <w:lang w:val="en-US"/>
-        </w:rPr>
-        <w:t xml:space="preserve"> </w:t>
-      </w:r>
-    </w:p>
-    <w:p>
-      <w:pPr>
-        <w:jc w:val="both"/>
-        <w:rPr>
-          <w:b/>
-          <w:sz w:val="28"/>
-          <w:szCs w:val="28"/>
-          <w:lang w:val="en-US"/>
-        </w:rPr>
-      </w:pPr>
-    </w:p>
-    <w:p>
-      <w:pPr>
-        <w:jc w:val="both"/>
-        <w:rPr>
-          <w:b/>
-          <w:sz w:val="28"/>
-          <w:szCs w:val="28"/>
-          <w:lang w:val="en-US"/>
-        </w:rPr>
-      </w:pPr>
-      <w:r>
-        <w:rPr>
-          <w:b/>
-          <w:sz w:val="28"/>
-          <w:szCs w:val="28"/>
-          <w:lang w:val="en-US"/>
-        </w:rPr>
-        <w:t>C</w:t>
-      </w:r>
-      <w:proofErr w:type="spellStart"/>
-      <w:r>
-        <w:rPr>
-          <w:b/>
-          <w:sz w:val="28"/>
-          <w:szCs w:val="28"/>
-        </w:rPr>
-        <w:t>правочная</w:t>
-      </w:r>
-      <w:proofErr w:type="spellEnd"/>
-      <w:r>
-        <w:rPr>
-          <w:b/>
-          <w:sz w:val="28"/>
-          <w:szCs w:val="28"/>
-          <w:lang w:val="en-US"/>
-        </w:rPr>
-        <w:t xml:space="preserve"> </w:t>
-      </w:r>
-      <w:r>
-        <w:rPr>
-          <w:b/>
-          <w:sz w:val="28"/>
-          <w:szCs w:val="28"/>
-        </w:rPr>
-        <w:t>информация</w:t>
-      </w:r>
-      <w:r>
-        <w:rPr>
-          <w:b/>
-          <w:sz w:val="28"/>
-          <w:szCs w:val="28"/>
-          <w:lang w:val="en-US"/>
-        </w:rPr>
-        <w:t xml:space="preserve"> </w:t>
-      </w:r>
-      <w:r>
-        <w:rPr>
-          <w:b/>
-          <w:sz w:val="28"/>
-          <w:szCs w:val="28"/>
-        </w:rPr>
-        <w:t>по</w:t>
-      </w:r>
-      <w:r>
-        <w:rPr>
-          <w:b/>
-          <w:sz w:val="28"/>
-          <w:szCs w:val="28"/>
-          <w:lang w:val="en-US"/>
-        </w:rPr>
-        <w:t xml:space="preserve"> </w:t>
-      </w:r>
-      <w:r>
-        <w:rPr>
-          <w:b/>
-          <w:sz w:val="28"/>
-          <w:szCs w:val="28"/>
-          <w:lang w:val="en-US"/>
-        </w:rPr>
-        <w:t>Node</w:t>
-      </w:r>
-      <w:r>
-        <w:rPr>
-          <w:b/>
-          <w:sz w:val="28"/>
-          <w:szCs w:val="28"/>
-          <w:lang w:val="en-US"/>
-        </w:rPr>
-        <w:t>.</w:t>
-      </w:r>
-      <w:r>
-        <w:rPr>
-          <w:b/>
-          <w:sz w:val="28"/>
-          <w:szCs w:val="28"/>
-          <w:lang w:val="en-US"/>
-        </w:rPr>
-        <w:t>js</w:t>
-      </w:r>
-      <w:r>
-        <w:rPr>
-          <w:b/>
-          <w:sz w:val="28"/>
-          <w:szCs w:val="28"/>
-          <w:lang w:val="en-US"/>
-        </w:rPr>
-        <w:t>/</w:t>
-      </w:r>
-      <w:r>
-        <w:rPr>
-          <w:sz w:val="28"/>
-          <w:szCs w:val="28"/>
-          <w:lang w:val="en-US"/>
-        </w:rPr>
-        <w:t xml:space="preserve"> </w:t>
-      </w:r>
-      <w:r>
-        <w:rPr>
-          <w:b/>
-          <w:sz w:val="28"/>
-          <w:szCs w:val="28"/>
-          <w:lang w:val="en-US"/>
-        </w:rPr>
-        <w:t>Express</w:t>
-      </w:r>
-      <w:r>
-        <w:rPr>
-          <w:b/>
-          <w:sz w:val="28"/>
-          <w:szCs w:val="28"/>
-          <w:lang w:val="en-US"/>
-        </w:rPr>
-        <w:t>:</w:t>
-      </w:r>
-    </w:p>
-    <w:p>
-      <w:pPr>
-        <w:jc w:val="both"/>
-        <w:rPr>
-          <w:lang w:val="en-US"/>
-        </w:rPr>
-      </w:pPr>
-      <w:hyperlink r:id="rId15" w:history="1">
-        <w:r>
-          <w:rPr>
-            <w:rStyle w:val="a6"/>
-            <w:lang w:val="en-US"/>
-          </w:rPr>
-          <w:t>https://developer.mozilla.org/ru/docs/Learn/Server-side/Express_Nodejs</w:t>
-        </w:r>
-      </w:hyperlink>
-      <w:r>
-        <w:rPr>
-          <w:lang w:val="en-US"/>
-        </w:rPr>
-        <w:t xml:space="preserve"> </w:t>
-      </w:r>
-    </w:p>
-    <w:p>
-      <w:pPr>
-        <w:jc w:val="both"/>
-        <w:rPr>
-          <w:lang w:val="en-US"/>
-        </w:rPr>
-      </w:pPr>
-      <w:hyperlink r:id="rId16" w:history="1">
-        <w:r>
-          <w:rPr>
-            <w:rStyle w:val="a6"/>
-            <w:lang w:val="en-US"/>
-          </w:rPr>
-          <w:t xml:space="preserve">Node.JS | </w:t>
-        </w:r>
-        <w:r>
-          <w:rPr>
-            <w:rStyle w:val="a6"/>
-          </w:rPr>
-          <w:t>Введение</w:t>
-        </w:r>
-        <w:r>
-          <w:rPr>
-            <w:rStyle w:val="a6"/>
-            <w:lang w:val="en-US"/>
-          </w:rPr>
-          <w:t xml:space="preserve"> </w:t>
-        </w:r>
-        <w:r>
-          <w:rPr>
-            <w:rStyle w:val="a6"/>
-          </w:rPr>
-          <w:t>и</w:t>
-        </w:r>
-        <w:r>
-          <w:rPr>
-            <w:rStyle w:val="a6"/>
-            <w:lang w:val="en-US"/>
-          </w:rPr>
-          <w:t xml:space="preserve"> </w:t>
-        </w:r>
-        <w:r>
-          <w:rPr>
-            <w:rStyle w:val="a6"/>
-          </w:rPr>
-          <w:t>начало</w:t>
-        </w:r>
-        <w:r>
-          <w:rPr>
-            <w:rStyle w:val="a6"/>
-            <w:lang w:val="en-US"/>
-          </w:rPr>
-          <w:t xml:space="preserve"> </w:t>
-        </w:r>
-        <w:r>
-          <w:rPr>
-            <w:rStyle w:val="a6"/>
-          </w:rPr>
-          <w:t>работы</w:t>
-        </w:r>
-        <w:r>
-          <w:rPr>
-            <w:rStyle w:val="a6"/>
-            <w:lang w:val="en-US"/>
-          </w:rPr>
-          <w:t xml:space="preserve"> (metanit.com)</w:t>
-        </w:r>
-      </w:hyperlink>
-      <w:r>
-        <w:rPr>
-          <w:lang w:val="en-US"/>
-        </w:rPr>
-        <w:t xml:space="preserve">      </w:t>
-      </w:r>
-      <w:hyperlink r:id="rId17" w:history="1">
-        <w:r>
-          <w:rPr>
-            <w:rStyle w:val="a6"/>
-            <w:lang w:val="en-US"/>
-          </w:rPr>
-          <w:t xml:space="preserve">Node.JS | </w:t>
-        </w:r>
-        <w:r>
-          <w:rPr>
-            <w:rStyle w:val="a6"/>
-          </w:rPr>
-          <w:t>Начало</w:t>
-        </w:r>
-        <w:r>
-          <w:rPr>
-            <w:rStyle w:val="a6"/>
-            <w:lang w:val="en-US"/>
-          </w:rPr>
-          <w:t xml:space="preserve"> </w:t>
-        </w:r>
-        <w:r>
-          <w:rPr>
-            <w:rStyle w:val="a6"/>
-          </w:rPr>
-          <w:t>работы</w:t>
-        </w:r>
-        <w:r>
-          <w:rPr>
-            <w:rStyle w:val="a6"/>
-            <w:lang w:val="en-US"/>
-          </w:rPr>
-          <w:t xml:space="preserve"> </w:t>
-        </w:r>
-        <w:r>
-          <w:rPr>
-            <w:rStyle w:val="a6"/>
-          </w:rPr>
-          <w:t>с</w:t>
-        </w:r>
-        <w:r>
-          <w:rPr>
-            <w:rStyle w:val="a6"/>
-            <w:lang w:val="en-US"/>
-          </w:rPr>
-          <w:t xml:space="preserve"> Express (metanit.com)</w:t>
-        </w:r>
-      </w:hyperlink>
-    </w:p>
-    <w:p>
-      <w:pPr>
-        <w:jc w:val="both"/>
-        <w:rPr>
-          <w:lang w:val="en-US"/>
-        </w:rPr>
-      </w:pPr>
-      <w:hyperlink r:id="rId18" w:history="1">
-        <w:r>
-          <w:rPr>
-            <w:rStyle w:val="a6"/>
-            <w:lang w:val="en-US"/>
-          </w:rPr>
-          <w:t>Guides | Node.js (nodejs.org)</w:t>
-        </w:r>
-      </w:hyperlink>
-    </w:p>
-    <w:p>
-      <w:pPr>
-        <w:jc w:val="both"/>
-      </w:pPr>
-      <w:hyperlink r:id="rId19" w:history="1">
         <w:r>
           <w:rPr>
             <w:rStyle w:val="a6"/>
@@ -1095,7 +1153,7 @@
           <w:b/>
         </w:rPr>
       </w:pPr>
-      <w:hyperlink r:id="rId20" w:history="1">
+      <w:hyperlink r:id="rId15" w:history="1">
         <w:r>
           <w:rPr>
             <w:rStyle w:val="a6"/>
@@ -1222,7 +1280,7 @@
         </w:rPr>
         <w:t xml:space="preserve">сервера и </w:t>
       </w:r>
-      <w:hyperlink r:id="rId21" w:tgtFrame="_blank" w:history="1">
+      <w:hyperlink r:id="rId16" w:tgtFrame="_blank" w:history="1">
         <w:r>
           <w:rPr>
             <w:sz w:val="28"/>
@@ -1292,12 +1350,14 @@
           <w:b/>
           <w:sz w:val="28"/>
           <w:szCs w:val="28"/>
-        </w:rPr>
-      </w:pPr>
-      <w:r>
-        <w:rPr>
-          <w:sz w:val="28"/>
-          <w:szCs w:val="28"/>
+          <w:highlight w:val="yellow"/>
+        </w:rPr>
+      </w:pPr>
+      <w:r>
+        <w:rPr>
+          <w:sz w:val="28"/>
+          <w:szCs w:val="28"/>
+          <w:highlight w:val="yellow"/>
         </w:rPr>
         <w:t xml:space="preserve">Определить </w:t>
       </w:r>
@@ -1305,6 +1365,7 @@
         <w:rPr>
           <w:sz w:val="28"/>
           <w:szCs w:val="28"/>
+          <w:highlight w:val="yellow"/>
         </w:rPr>
         <w:t xml:space="preserve">и реализовать </w:t>
       </w:r>
@@ -1313,6 +1374,7 @@
           <w:b/>
           <w:sz w:val="28"/>
           <w:szCs w:val="28"/>
+          <w:highlight w:val="yellow"/>
         </w:rPr>
         <w:t>минимум четыре модели</w:t>
       </w:r>
@@ -1320,6 +1382,7 @@
         <w:rPr>
           <w:sz w:val="28"/>
           <w:szCs w:val="28"/>
+          <w:highlight w:val="yellow"/>
         </w:rPr>
         <w:t xml:space="preserve"> в соответствии с предметной областью предыдущих ЛР (</w:t>
       </w:r>
@@ -1327,6 +1390,7 @@
         <w:rPr>
           <w:sz w:val="28"/>
           <w:szCs w:val="28"/>
+          <w:highlight w:val="yellow"/>
         </w:rPr>
         <w:t xml:space="preserve">использовать встроенные </w:t>
       </w:r>
@@ -1335,6 +1399,7 @@
         <w:rPr>
           <w:sz w:val="28"/>
           <w:szCs w:val="28"/>
+          <w:highlight w:val="yellow"/>
         </w:rPr>
         <w:t>валидаторы</w:t>
       </w:r>
@@ -1343,6 +1408,7 @@
         <w:rPr>
           <w:sz w:val="28"/>
           <w:szCs w:val="28"/>
+          <w:highlight w:val="yellow"/>
         </w:rPr>
         <w:t>, подходящие типы данных)</w:t>
       </w:r>
@@ -1350,6 +1416,7 @@
         <w:rPr>
           <w:sz w:val="28"/>
           <w:szCs w:val="28"/>
+          <w:highlight w:val="yellow"/>
         </w:rPr>
         <w:t xml:space="preserve">. В качестве базы данных рекомендована </w:t>
       </w:r>
@@ -1359,6 +1426,7 @@
           <w:color w:val="000000"/>
           <w:sz w:val="28"/>
           <w:szCs w:val="28"/>
+          <w:highlight w:val="yellow"/>
           <w:shd w:val="clear" w:color="auto" w:fill="F7F7FA"/>
         </w:rPr>
         <w:t>MongoDB</w:t>
@@ -1368,6 +1436,7 @@
         <w:rPr>
           <w:sz w:val="28"/>
           <w:szCs w:val="28"/>
+          <w:highlight w:val="yellow"/>
         </w:rPr>
         <w:t xml:space="preserve"> </w:t>
       </w:r>
@@ -1375,15 +1444,17 @@
         <w:rPr>
           <w:sz w:val="28"/>
           <w:szCs w:val="28"/>
+          <w:highlight w:val="yellow"/>
         </w:rPr>
         <w:t>(</w:t>
       </w:r>
-      <w:hyperlink r:id="rId22" w:history="1">
+      <w:hyperlink r:id="rId17" w:history="1">
         <w:r>
           <w:rPr>
             <w:rStyle w:val="a6"/>
             <w:sz w:val="28"/>
             <w:szCs w:val="28"/>
+            <w:highlight w:val="yellow"/>
           </w:rPr>
           <w:t>https://metanit.com/web/nodejs/6.1.php</w:t>
         </w:r>
@@ -1392,11 +1463,352 @@
         <w:rPr>
           <w:sz w:val="28"/>
           <w:szCs w:val="28"/>
+          <w:highlight w:val="yellow"/>
         </w:rPr>
         <w:t xml:space="preserve">, </w:t>
       </w:r>
-      <w:hyperlink r:id="rId23" w:history="1">
-        <w:proofErr w:type="gramStart"/>
+      <w:hyperlink r:id="rId18" w:history="1">
+        <w:r>
+          <w:rPr>
+            <w:rStyle w:val="a6"/>
+            <w:sz w:val="28"/>
+            <w:szCs w:val="28"/>
+            <w:highlight w:val="yellow"/>
+          </w:rPr>
+          <w:t>https://developer.mozilla.org/en-US/docs/Learn/Server-side/Express_Nodejs/mongoose</w:t>
+        </w:r>
+      </w:hyperlink>
+      <w:r>
+        <w:rPr>
+          <w:sz w:val="28"/>
+          <w:szCs w:val="28"/>
+          <w:highlight w:val="yellow"/>
+        </w:rPr>
+        <w:t xml:space="preserve"> </w:t>
+      </w:r>
+      <w:r>
+        <w:rPr>
+          <w:sz w:val="28"/>
+          <w:szCs w:val="28"/>
+          <w:highlight w:val="yellow"/>
+        </w:rPr>
+        <w:t xml:space="preserve"> </w:t>
+      </w:r>
+      <w:r>
+        <w:rPr>
+          <w:sz w:val="28"/>
+          <w:szCs w:val="28"/>
+          <w:highlight w:val="yellow"/>
+        </w:rPr>
+        <w:t>)</w:t>
+      </w:r>
+      <w:r>
+        <w:rPr>
+          <w:sz w:val="28"/>
+          <w:szCs w:val="28"/>
+          <w:highlight w:val="yellow"/>
+        </w:rPr>
+        <w:t xml:space="preserve">, но можно другую по </w:t>
+      </w:r>
+      <w:r>
+        <w:rPr>
+          <w:sz w:val="28"/>
+          <w:szCs w:val="28"/>
+          <w:highlight w:val="yellow"/>
+        </w:rPr>
+        <w:t>желанию</w:t>
+      </w:r>
+      <w:r>
+        <w:rPr>
+          <w:sz w:val="28"/>
+          <w:szCs w:val="28"/>
+          <w:highlight w:val="yellow"/>
+        </w:rPr>
+        <w:t>.</w:t>
+      </w:r>
+    </w:p>
+    <w:p>
+      <w:pPr>
+        <w:jc w:val="center"/>
+        <w:rPr>
+          <w:sz w:val="28"/>
+          <w:szCs w:val="28"/>
+          <w:highlight w:val="yellow"/>
+        </w:rPr>
+      </w:pPr>
+    </w:p>
+    <w:p>
+      <w:pPr>
+        <w:numPr>
+          <w:ilvl w:val="0"/>
+          <w:numId w:val="1"/>
+        </w:numPr>
+        <w:jc w:val="both"/>
+        <w:rPr>
+          <w:sz w:val="28"/>
+          <w:szCs w:val="28"/>
+          <w:highlight w:val="yellow"/>
+        </w:rPr>
+      </w:pPr>
+      <w:r>
+        <w:rPr>
+          <w:sz w:val="28"/>
+          <w:szCs w:val="28"/>
+          <w:highlight w:val="yellow"/>
+        </w:rPr>
+        <w:t xml:space="preserve">Реализовать механизмы авторизации/аутентификации с помощью логина/пароля и </w:t>
+      </w:r>
+      <w:r>
+        <w:rPr>
+          <w:sz w:val="28"/>
+          <w:szCs w:val="28"/>
+          <w:highlight w:val="yellow"/>
+          <w:shd w:val="clear" w:color="auto" w:fill="FFFFFF"/>
+        </w:rPr>
+        <w:t xml:space="preserve">через аккаунты </w:t>
+      </w:r>
+      <w:proofErr w:type="spellStart"/>
+      <w:r>
+        <w:rPr>
+          <w:sz w:val="28"/>
+          <w:szCs w:val="28"/>
+          <w:highlight w:val="yellow"/>
+          <w:shd w:val="clear" w:color="auto" w:fill="FFFFFF"/>
+        </w:rPr>
+        <w:t>Google</w:t>
+      </w:r>
+      <w:proofErr w:type="spellEnd"/>
+      <w:r>
+        <w:rPr>
+          <w:sz w:val="28"/>
+          <w:szCs w:val="28"/>
+          <w:highlight w:val="yellow"/>
+          <w:shd w:val="clear" w:color="auto" w:fill="FFFFFF"/>
+        </w:rPr>
+        <w:t xml:space="preserve"> и </w:t>
+      </w:r>
+      <w:proofErr w:type="spellStart"/>
+      <w:r>
+        <w:rPr>
+          <w:sz w:val="28"/>
+          <w:szCs w:val="28"/>
+          <w:highlight w:val="yellow"/>
+          <w:shd w:val="clear" w:color="auto" w:fill="FFFFFF"/>
+        </w:rPr>
+        <w:t>Facebook</w:t>
+      </w:r>
+      <w:proofErr w:type="spellEnd"/>
+      <w:r>
+        <w:rPr>
+          <w:sz w:val="28"/>
+          <w:szCs w:val="28"/>
+          <w:highlight w:val="yellow"/>
+          <w:shd w:val="clear" w:color="auto" w:fill="FFFFFF"/>
+        </w:rPr>
+        <w:t xml:space="preserve"> (</w:t>
+      </w:r>
+      <w:hyperlink r:id="rId19" w:history="1">
+        <w:r>
+          <w:rPr>
+            <w:rStyle w:val="a6"/>
+            <w:sz w:val="28"/>
+            <w:szCs w:val="28"/>
+            <w:highlight w:val="yellow"/>
+          </w:rPr>
+          <w:t xml:space="preserve">Аутентификация </w:t>
+        </w:r>
+        <w:r>
+          <w:rPr>
+            <w:rStyle w:val="a6"/>
+            <w:rFonts w:ascii="Segoe UI Symbol" w:hAnsi="Segoe UI Symbol" w:cs="Segoe UI Symbol"/>
+            <w:sz w:val="28"/>
+            <w:szCs w:val="28"/>
+            <w:highlight w:val="yellow"/>
+          </w:rPr>
+          <w:t>⚡</w:t>
+        </w:r>
+        <w:r>
+          <w:rPr>
+            <w:rStyle w:val="a6"/>
+            <w:sz w:val="28"/>
+            <w:szCs w:val="28"/>
+            <w:highlight w:val="yellow"/>
+          </w:rPr>
+          <w:t>️ Node.js с примерами кода (nodejsdev.ru)</w:t>
+        </w:r>
+      </w:hyperlink>
+      <w:r>
+        <w:rPr>
+          <w:sz w:val="28"/>
+          <w:szCs w:val="28"/>
+          <w:highlight w:val="yellow"/>
+          <w:shd w:val="clear" w:color="auto" w:fill="FFFFFF"/>
+        </w:rPr>
+        <w:t>)</w:t>
+      </w:r>
+      <w:r>
+        <w:rPr>
+          <w:sz w:val="28"/>
+          <w:szCs w:val="28"/>
+          <w:highlight w:val="yellow"/>
+        </w:rPr>
+        <w:t>;</w:t>
+      </w:r>
+    </w:p>
+    <w:p>
+      <w:pPr>
+        <w:jc w:val="both"/>
+        <w:rPr>
+          <w:sz w:val="28"/>
+          <w:szCs w:val="28"/>
+          <w:highlight w:val="yellow"/>
+        </w:rPr>
+      </w:pPr>
+    </w:p>
+    <w:p>
+      <w:pPr>
+        <w:numPr>
+          <w:ilvl w:val="0"/>
+          <w:numId w:val="1"/>
+        </w:numPr>
+        <w:jc w:val="both"/>
+        <w:rPr>
+          <w:sz w:val="28"/>
+          <w:szCs w:val="28"/>
+        </w:rPr>
+      </w:pPr>
+      <w:r>
+        <w:rPr>
+          <w:sz w:val="28"/>
+          <w:szCs w:val="28"/>
+          <w:highlight w:val="yellow"/>
+        </w:rPr>
+        <w:t>Для авторизованного юзера р</w:t>
+      </w:r>
+      <w:r>
+        <w:rPr>
+          <w:sz w:val="28"/>
+          <w:szCs w:val="28"/>
+          <w:highlight w:val="yellow"/>
+        </w:rPr>
+        <w:t xml:space="preserve">еализовать </w:t>
+      </w:r>
+      <w:r>
+        <w:rPr>
+          <w:sz w:val="28"/>
+          <w:szCs w:val="28"/>
+          <w:highlight w:val="yellow"/>
+          <w:lang w:val="en-US"/>
+        </w:rPr>
+        <w:t>CRUD</w:t>
+      </w:r>
+      <w:r>
+        <w:rPr>
+          <w:sz w:val="28"/>
+          <w:szCs w:val="28"/>
+          <w:highlight w:val="yellow"/>
+        </w:rPr>
+        <w:t xml:space="preserve"> (</w:t>
+      </w:r>
+      <w:r>
+        <w:rPr>
+          <w:sz w:val="28"/>
+          <w:szCs w:val="28"/>
+          <w:highlight w:val="yellow"/>
+          <w:lang w:val="en-US"/>
+        </w:rPr>
+        <w:t>create</w:t>
+      </w:r>
+      <w:r>
+        <w:rPr>
+          <w:sz w:val="28"/>
+          <w:szCs w:val="28"/>
+          <w:highlight w:val="yellow"/>
+        </w:rPr>
+        <w:t xml:space="preserve">, </w:t>
+      </w:r>
+      <w:r>
+        <w:rPr>
+          <w:sz w:val="28"/>
+          <w:szCs w:val="28"/>
+          <w:highlight w:val="yellow"/>
+          <w:lang w:val="en-US"/>
+        </w:rPr>
+        <w:t>read</w:t>
+      </w:r>
+      <w:r>
+        <w:rPr>
+          <w:sz w:val="28"/>
+          <w:szCs w:val="28"/>
+          <w:highlight w:val="yellow"/>
+        </w:rPr>
+        <w:t xml:space="preserve">, </w:t>
+      </w:r>
+      <w:r>
+        <w:rPr>
+          <w:sz w:val="28"/>
+          <w:szCs w:val="28"/>
+          <w:highlight w:val="yellow"/>
+          <w:lang w:val="en-US"/>
+        </w:rPr>
+        <w:t>update</w:t>
+      </w:r>
+      <w:r>
+        <w:rPr>
+          <w:sz w:val="28"/>
+          <w:szCs w:val="28"/>
+          <w:highlight w:val="yellow"/>
+        </w:rPr>
+        <w:t xml:space="preserve">, </w:t>
+      </w:r>
+      <w:r>
+        <w:rPr>
+          <w:sz w:val="28"/>
+          <w:szCs w:val="28"/>
+          <w:highlight w:val="yellow"/>
+          <w:lang w:val="en-US"/>
+        </w:rPr>
+        <w:t>delete</w:t>
+      </w:r>
+      <w:r>
+        <w:rPr>
+          <w:sz w:val="28"/>
+          <w:szCs w:val="28"/>
+          <w:highlight w:val="yellow"/>
+        </w:rPr>
+        <w:t xml:space="preserve">) операции </w:t>
+      </w:r>
+      <w:r>
+        <w:rPr>
+          <w:sz w:val="28"/>
+          <w:szCs w:val="28"/>
+          <w:highlight w:val="yellow"/>
+        </w:rPr>
+        <w:t>и возможность поиска</w:t>
+      </w:r>
+      <w:r>
+        <w:rPr>
+          <w:sz w:val="28"/>
+          <w:szCs w:val="28"/>
+          <w:highlight w:val="yellow"/>
+        </w:rPr>
+        <w:t>,</w:t>
+      </w:r>
+      <w:r>
+        <w:rPr>
+          <w:sz w:val="28"/>
+          <w:szCs w:val="28"/>
+        </w:rPr>
+        <w:t xml:space="preserve"> сортировки</w:t>
+      </w:r>
+      <w:r>
+        <w:rPr>
+          <w:sz w:val="28"/>
+          <w:szCs w:val="28"/>
+        </w:rPr>
+        <w:t xml:space="preserve"> записей </w:t>
+      </w:r>
+      <w:hyperlink r:id="rId20" w:history="1">
         <w:r>
           <w:rPr>
             <w:rStyle w:val="a6"/>
@@ -1411,6 +1823,13 @@
           <w:sz w:val="28"/>
           <w:szCs w:val="28"/>
         </w:rPr>
+        <w:t>;</w:t>
+      </w:r>
+      <w:r>
+        <w:rPr>
+          <w:sz w:val="28"/>
+          <w:szCs w:val="28"/>
+        </w:rPr>
         <w:t xml:space="preserve"> </w:t>
       </w:r>
       <w:r>
@@ -1418,313 +1837,6 @@
           <w:sz w:val="28"/>
           <w:szCs w:val="28"/>
         </w:rPr>
-        <w:t xml:space="preserve"> </w:t>
-      </w:r>
-      <w:r>
-        <w:rPr>
-          <w:sz w:val="28"/>
-          <w:szCs w:val="28"/>
-        </w:rPr>
-        <w:t>)</w:t>
-      </w:r>
-      <w:proofErr w:type="gramEnd"/>
-      <w:r>
-        <w:rPr>
-          <w:sz w:val="28"/>
-          <w:szCs w:val="28"/>
-        </w:rPr>
-        <w:t xml:space="preserve">, но можно другую по </w:t>
-      </w:r>
-      <w:r>
-        <w:rPr>
-          <w:sz w:val="28"/>
-          <w:szCs w:val="28"/>
-        </w:rPr>
-        <w:t>желанию</w:t>
-      </w:r>
-      <w:r>
-        <w:rPr>
-          <w:sz w:val="28"/>
-          <w:szCs w:val="28"/>
-        </w:rPr>
-        <w:t>.</w:t>
-      </w:r>
-    </w:p>
-    <w:p>
-      <w:pPr>
-        <w:jc w:val="center"/>
-        <w:rPr>
-          <w:sz w:val="28"/>
-          <w:szCs w:val="28"/>
-        </w:rPr>
-      </w:pPr>
-    </w:p>
-    <w:p>
-      <w:pPr>
-        <w:numPr>
-          <w:ilvl w:val="0"/>
-          <w:numId w:val="1"/>
-        </w:numPr>
-        <w:jc w:val="both"/>
-        <w:rPr>
-          <w:sz w:val="28"/>
-          <w:szCs w:val="28"/>
-        </w:rPr>
-      </w:pPr>
-      <w:r>
-        <w:rPr>
-          <w:sz w:val="28"/>
-          <w:szCs w:val="28"/>
-        </w:rPr>
-        <w:t xml:space="preserve">Реализовать механизмы авторизации/аутентификации с помощью логина/пароля и </w:t>
-      </w:r>
-      <w:r>
-        <w:rPr>
-          <w:sz w:val="28"/>
-          <w:szCs w:val="28"/>
-          <w:shd w:val="clear" w:color="auto" w:fill="FFFFFF"/>
-        </w:rPr>
-        <w:t xml:space="preserve">через аккаунты </w:t>
-      </w:r>
-      <w:proofErr w:type="spellStart"/>
-      <w:r>
-        <w:rPr>
-          <w:sz w:val="28"/>
-          <w:szCs w:val="28"/>
-          <w:shd w:val="clear" w:color="auto" w:fill="FFFFFF"/>
-        </w:rPr>
-        <w:t>Google</w:t>
-      </w:r>
-      <w:proofErr w:type="spellEnd"/>
-      <w:r>
-        <w:rPr>
-          <w:sz w:val="28"/>
-          <w:szCs w:val="28"/>
-          <w:shd w:val="clear" w:color="auto" w:fill="FFFFFF"/>
-        </w:rPr>
-        <w:t xml:space="preserve"> и </w:t>
-      </w:r>
-      <w:proofErr w:type="spellStart"/>
-      <w:r>
-        <w:rPr>
-          <w:sz w:val="28"/>
-          <w:szCs w:val="28"/>
-          <w:shd w:val="clear" w:color="auto" w:fill="FFFFFF"/>
-        </w:rPr>
-        <w:t>Facebook</w:t>
-      </w:r>
-      <w:proofErr w:type="spellEnd"/>
-      <w:r>
-        <w:rPr>
-          <w:sz w:val="28"/>
-          <w:szCs w:val="28"/>
-          <w:shd w:val="clear" w:color="auto" w:fill="FFFFFF"/>
-        </w:rPr>
-        <w:t xml:space="preserve"> (</w:t>
-      </w:r>
-      <w:hyperlink r:id="rId24" w:history="1">
-        <w:r>
-          <w:rPr>
-            <w:rStyle w:val="a6"/>
-            <w:sz w:val="28"/>
-            <w:szCs w:val="28"/>
-          </w:rPr>
-          <w:t xml:space="preserve">Аутентификация </w:t>
-        </w:r>
-        <w:r>
-          <w:rPr>
-            <w:rStyle w:val="a6"/>
-            <w:rFonts w:ascii="Segoe UI Symbol" w:hAnsi="Segoe UI Symbol" w:cs="Segoe UI Symbol"/>
-            <w:sz w:val="28"/>
-            <w:szCs w:val="28"/>
-          </w:rPr>
-          <w:t>⚡</w:t>
-        </w:r>
-        <w:r>
-          <w:rPr>
-            <w:rStyle w:val="a6"/>
-            <w:sz w:val="28"/>
-            <w:szCs w:val="28"/>
-          </w:rPr>
-          <w:t>️ Node.js с примерами кода (nodejsdev.ru)</w:t>
-        </w:r>
-      </w:hyperlink>
-      <w:r>
-        <w:rPr>
-          <w:sz w:val="28"/>
-          <w:szCs w:val="28"/>
-          <w:shd w:val="clear" w:color="auto" w:fill="FFFFFF"/>
-        </w:rPr>
-        <w:t>)</w:t>
-      </w:r>
-      <w:r>
-        <w:rPr>
-          <w:sz w:val="28"/>
-          <w:szCs w:val="28"/>
-        </w:rPr>
-        <w:t>;</w:t>
-      </w:r>
-    </w:p>
-    <w:p>
-      <w:pPr>
-        <w:jc w:val="both"/>
-        <w:rPr>
-          <w:sz w:val="28"/>
-          <w:szCs w:val="28"/>
-        </w:rPr>
-      </w:pPr>
-    </w:p>
-    <w:p>
-      <w:pPr>
-        <w:numPr>
-          <w:ilvl w:val="0"/>
-          <w:numId w:val="1"/>
-        </w:numPr>
-        <w:jc w:val="both"/>
-        <w:rPr>
-          <w:sz w:val="28"/>
-          <w:szCs w:val="28"/>
-        </w:rPr>
-      </w:pPr>
-      <w:r>
-        <w:rPr>
-          <w:sz w:val="28"/>
-          <w:szCs w:val="28"/>
-        </w:rPr>
-        <w:t>Для авторизованного юзера р</w:t>
-      </w:r>
-      <w:r>
-        <w:rPr>
-          <w:sz w:val="28"/>
-          <w:szCs w:val="28"/>
-        </w:rPr>
-        <w:t xml:space="preserve">еализовать </w:t>
-      </w:r>
-      <w:r>
-        <w:rPr>
-          <w:sz w:val="28"/>
-          <w:szCs w:val="28"/>
-          <w:lang w:val="en-US"/>
-        </w:rPr>
-        <w:t>CRUD</w:t>
-      </w:r>
-      <w:r>
-        <w:rPr>
-          <w:sz w:val="28"/>
-          <w:szCs w:val="28"/>
-        </w:rPr>
-        <w:t xml:space="preserve"> (</w:t>
-      </w:r>
-      <w:r>
-        <w:rPr>
-          <w:sz w:val="28"/>
-          <w:szCs w:val="28"/>
-          <w:lang w:val="en-US"/>
-        </w:rPr>
-        <w:t>create</w:t>
-      </w:r>
-      <w:r>
-        <w:rPr>
-          <w:sz w:val="28"/>
-          <w:szCs w:val="28"/>
-        </w:rPr>
-        <w:t xml:space="preserve">, </w:t>
-      </w:r>
-      <w:r>
-        <w:rPr>
-          <w:sz w:val="28"/>
-          <w:szCs w:val="28"/>
-          <w:lang w:val="en-US"/>
-        </w:rPr>
-        <w:t>read</w:t>
-      </w:r>
-      <w:r>
-        <w:rPr>
-          <w:sz w:val="28"/>
-          <w:szCs w:val="28"/>
-        </w:rPr>
-        <w:t xml:space="preserve">, </w:t>
-      </w:r>
-      <w:r>
-        <w:rPr>
-          <w:sz w:val="28"/>
-          <w:szCs w:val="28"/>
-          <w:lang w:val="en-US"/>
-        </w:rPr>
-        <w:t>update</w:t>
-      </w:r>
-      <w:r>
-        <w:rPr>
-          <w:sz w:val="28"/>
-          <w:szCs w:val="28"/>
-        </w:rPr>
-        <w:t xml:space="preserve">, </w:t>
-      </w:r>
-      <w:r>
-        <w:rPr>
-          <w:sz w:val="28"/>
-          <w:szCs w:val="28"/>
-          <w:lang w:val="en-US"/>
-        </w:rPr>
-        <w:t>delete</w:t>
-      </w:r>
-      <w:r>
-        <w:rPr>
-          <w:sz w:val="28"/>
-          <w:szCs w:val="28"/>
-        </w:rPr>
-        <w:t xml:space="preserve">) операции </w:t>
-      </w:r>
-      <w:r>
-        <w:rPr>
-          <w:sz w:val="28"/>
-          <w:szCs w:val="28"/>
-        </w:rPr>
-        <w:t>и возможность поиска</w:t>
-      </w:r>
-      <w:r>
-        <w:rPr>
-          <w:sz w:val="28"/>
-          <w:szCs w:val="28"/>
-        </w:rPr>
-        <w:t>, сортировки</w:t>
-      </w:r>
-      <w:r>
-        <w:rPr>
-          <w:sz w:val="28"/>
-          <w:szCs w:val="28"/>
-        </w:rPr>
-        <w:t xml:space="preserve"> записей </w:t>
-      </w:r>
-      <w:hyperlink r:id="rId25" w:history="1">
-        <w:r>
-          <w:rPr>
-            <w:rStyle w:val="a6"/>
-            <w:sz w:val="28"/>
-            <w:szCs w:val="28"/>
-          </w:rPr>
-          <w:t>https://developer.mozilla.org/en-US/docs/Learn/Server-side/Express_Nodejs/mongoose</w:t>
-        </w:r>
-      </w:hyperlink>
-      <w:r>
-        <w:rPr>
-          <w:sz w:val="28"/>
-          <w:szCs w:val="28"/>
-        </w:rPr>
-        <w:t>;</w:t>
-      </w:r>
-      <w:r>
-        <w:rPr>
-          <w:sz w:val="28"/>
-          <w:szCs w:val="28"/>
-        </w:rPr>
-        <w:t xml:space="preserve"> </w:t>
-      </w:r>
-      <w:r>
-        <w:rPr>
-          <w:sz w:val="28"/>
-          <w:szCs w:val="28"/>
-        </w:rPr>
         <w:t xml:space="preserve">Использовать формы, созданные с использованием </w:t>
       </w:r>
       <w:r>
@@ -1749,7 +1861,7 @@
         </w:rPr>
         <w:t xml:space="preserve">  </w:t>
       </w:r>
-      <w:hyperlink r:id="rId26" w:history="1">
+      <w:hyperlink r:id="rId21" w:history="1">
         <w:r>
           <w:rPr>
             <w:rStyle w:val="a6"/>
@@ -1777,12 +1889,14 @@
         <w:rPr>
           <w:sz w:val="28"/>
           <w:szCs w:val="28"/>
-        </w:rPr>
-      </w:pPr>
-      <w:r>
-        <w:rPr>
-          <w:sz w:val="28"/>
-          <w:szCs w:val="28"/>
+          <w:highlight w:val="yellow"/>
+        </w:rPr>
+      </w:pPr>
+      <w:r>
+        <w:rPr>
+          <w:sz w:val="28"/>
+          <w:szCs w:val="28"/>
+          <w:highlight w:val="yellow"/>
         </w:rPr>
         <w:t>Для неавторизованного пользователя обеспечить только просмотр, поиск, сортировку и авторизацию;</w:t>
       </w:r>
@@ -2097,12 +2211,14 @@
         <w:rPr>
           <w:sz w:val="28"/>
           <w:szCs w:val="28"/>
-        </w:rPr>
-      </w:pPr>
-      <w:r>
-        <w:rPr>
-          <w:sz w:val="28"/>
-          <w:szCs w:val="28"/>
+          <w:highlight w:val="yellow"/>
+        </w:rPr>
+      </w:pPr>
+      <w:r>
+        <w:rPr>
+          <w:sz w:val="28"/>
+          <w:szCs w:val="28"/>
+          <w:highlight w:val="yellow"/>
         </w:rPr>
         <w:t xml:space="preserve">Использовать разработанные компоненты внутри других компонентов. </w:t>
       </w:r>
@@ -2117,21 +2233,24 @@
         <w:rPr>
           <w:sz w:val="28"/>
           <w:szCs w:val="28"/>
-        </w:rPr>
-      </w:pPr>
-      <w:r>
-        <w:rPr>
-          <w:sz w:val="28"/>
-          <w:szCs w:val="28"/>
+          <w:highlight w:val="yellow"/>
+        </w:rPr>
+      </w:pPr>
+      <w:r>
+        <w:rPr>
+          <w:sz w:val="28"/>
+          <w:szCs w:val="28"/>
+          <w:highlight w:val="yellow"/>
         </w:rPr>
         <w:t xml:space="preserve">Добавить обработчики событий (минимум семь) – в функциональных компонентах, компонентах классах, с передачей параметров в обработчик события. </w:t>
       </w:r>
-      <w:hyperlink r:id="rId27" w:history="1">
+      <w:hyperlink r:id="rId22" w:history="1">
         <w:r>
           <w:rPr>
             <w:rStyle w:val="a6"/>
             <w:sz w:val="28"/>
             <w:szCs w:val="28"/>
+            <w:highlight w:val="yellow"/>
           </w:rPr>
           <w:t>https://metanit.com/web/react/2.5.php</w:t>
         </w:r>
@@ -2140,6 +2259,7 @@
         <w:rPr>
           <w:sz w:val="28"/>
           <w:szCs w:val="28"/>
+          <w:highlight w:val="yellow"/>
         </w:rPr>
         <w:t xml:space="preserve">  </w:t>
       </w:r>
@@ -2154,12 +2274,14 @@
         <w:rPr>
           <w:sz w:val="28"/>
           <w:szCs w:val="28"/>
-        </w:rPr>
-      </w:pPr>
-      <w:r>
-        <w:rPr>
-          <w:sz w:val="28"/>
-          <w:szCs w:val="28"/>
+          <w:highlight w:val="yellow"/>
+        </w:rPr>
+      </w:pPr>
+      <w:r>
+        <w:rPr>
+          <w:sz w:val="28"/>
+          <w:szCs w:val="28"/>
+          <w:highlight w:val="yellow"/>
         </w:rPr>
         <w:t xml:space="preserve">Продемонстрировать работу со </w:t>
       </w:r>
@@ -2167,6 +2289,7 @@
         <w:rPr>
           <w:sz w:val="28"/>
           <w:szCs w:val="28"/>
+          <w:highlight w:val="yellow"/>
           <w:lang w:val="en-US"/>
         </w:rPr>
         <w:t>state</w:t>
@@ -2175,16 +2298,17 @@
         <w:rPr>
           <w:sz w:val="28"/>
           <w:szCs w:val="28"/>
+          <w:highlight w:val="yellow"/>
         </w:rPr>
         <w:t xml:space="preserve"> (</w:t>
       </w:r>
-      <w:hyperlink r:id="rId28" w:history="1">
-        <w:proofErr w:type="gramStart"/>
+      <w:hyperlink r:id="rId23" w:history="1">
         <w:r>
           <w:rPr>
             <w:rStyle w:val="a6"/>
             <w:sz w:val="28"/>
             <w:szCs w:val="28"/>
+            <w:highlight w:val="yellow"/>
             <w:lang w:val="en-US"/>
           </w:rPr>
           <w:t>https</w:t>
@@ -2194,6 +2318,7 @@
             <w:rStyle w:val="a6"/>
             <w:sz w:val="28"/>
             <w:szCs w:val="28"/>
+            <w:highlight w:val="yellow"/>
           </w:rPr>
           <w:t>://</w:t>
         </w:r>
@@ -2203,6 +2328,7 @@
             <w:rStyle w:val="a6"/>
             <w:sz w:val="28"/>
             <w:szCs w:val="28"/>
+            <w:highlight w:val="yellow"/>
             <w:lang w:val="en-US"/>
           </w:rPr>
           <w:t>metanit</w:t>
@@ -2213,6 +2339,7 @@
             <w:rStyle w:val="a6"/>
             <w:sz w:val="28"/>
             <w:szCs w:val="28"/>
+            <w:highlight w:val="yellow"/>
           </w:rPr>
           <w:t>.</w:t>
         </w:r>
@@ -2221,6 +2348,7 @@
             <w:rStyle w:val="a6"/>
             <w:sz w:val="28"/>
             <w:szCs w:val="28"/>
+            <w:highlight w:val="yellow"/>
             <w:lang w:val="en-US"/>
           </w:rPr>
           <w:t>com</w:t>
@@ -2230,6 +2358,7 @@
             <w:rStyle w:val="a6"/>
             <w:sz w:val="28"/>
             <w:szCs w:val="28"/>
+            <w:highlight w:val="yellow"/>
           </w:rPr>
           <w:t>/</w:t>
         </w:r>
@@ -2238,6 +2367,7 @@
             <w:rStyle w:val="a6"/>
             <w:sz w:val="28"/>
             <w:szCs w:val="28"/>
+            <w:highlight w:val="yellow"/>
             <w:lang w:val="en-US"/>
           </w:rPr>
           <w:t>web</w:t>
@@ -2247,6 +2377,7 @@
             <w:rStyle w:val="a6"/>
             <w:sz w:val="28"/>
             <w:szCs w:val="28"/>
+            <w:highlight w:val="yellow"/>
           </w:rPr>
           <w:t>/</w:t>
         </w:r>
@@ -2255,6 +2386,7 @@
             <w:rStyle w:val="a6"/>
             <w:sz w:val="28"/>
             <w:szCs w:val="28"/>
+            <w:highlight w:val="yellow"/>
             <w:lang w:val="en-US"/>
           </w:rPr>
           <w:t>react</w:t>
@@ -2264,6 +2396,7 @@
             <w:rStyle w:val="a6"/>
             <w:sz w:val="28"/>
             <w:szCs w:val="28"/>
+            <w:highlight w:val="yellow"/>
           </w:rPr>
           <w:t>/2.4.</w:t>
         </w:r>
@@ -2273,6 +2406,7 @@
             <w:rStyle w:val="a6"/>
             <w:sz w:val="28"/>
             <w:szCs w:val="28"/>
+            <w:highlight w:val="yellow"/>
             <w:lang w:val="en-US"/>
           </w:rPr>
           <w:t>php</w:t>
@@ -2283,10 +2417,10 @@
         <w:rPr>
           <w:sz w:val="28"/>
           <w:szCs w:val="28"/>
+          <w:highlight w:val="yellow"/>
         </w:rPr>
         <w:t xml:space="preserve"> )</w:t>
       </w:r>
-      <w:proofErr w:type="gramEnd"/>
     </w:p>
     <w:p>
       <w:pPr>
@@ -2298,12 +2432,14 @@
         <w:rPr>
           <w:sz w:val="28"/>
           <w:szCs w:val="28"/>
-        </w:rPr>
-      </w:pPr>
-      <w:r>
-        <w:rPr>
-          <w:sz w:val="28"/>
-          <w:szCs w:val="28"/>
+          <w:highlight w:val="yellow"/>
+        </w:rPr>
+      </w:pPr>
+      <w:r>
+        <w:rPr>
+          <w:sz w:val="28"/>
+          <w:szCs w:val="28"/>
+          <w:highlight w:val="yellow"/>
         </w:rPr>
         <w:t xml:space="preserve">Продемонстрировать </w:t>
       </w:r>
@@ -2311,6 +2447,7 @@
         <w:rPr>
           <w:sz w:val="28"/>
           <w:szCs w:val="28"/>
+          <w:highlight w:val="yellow"/>
         </w:rPr>
         <w:t>использование</w:t>
       </w:r>
@@ -2318,6 +2455,7 @@
         <w:rPr>
           <w:sz w:val="28"/>
           <w:szCs w:val="28"/>
+          <w:highlight w:val="yellow"/>
         </w:rPr>
         <w:t xml:space="preserve"> люб</w:t>
       </w:r>
@@ -2325,6 +2463,7 @@
         <w:rPr>
           <w:sz w:val="28"/>
           <w:szCs w:val="28"/>
+          <w:highlight w:val="yellow"/>
         </w:rPr>
         <w:t>ого</w:t>
       </w:r>
@@ -2332,6 +2471,7 @@
         <w:rPr>
           <w:sz w:val="28"/>
           <w:szCs w:val="28"/>
+          <w:highlight w:val="yellow"/>
         </w:rPr>
         <w:t xml:space="preserve"> из хуков.</w:t>
       </w:r>
@@ -2352,6 +2492,7 @@
         <w:rPr>
           <w:sz w:val="28"/>
           <w:szCs w:val="28"/>
+          <w:highlight w:val="yellow"/>
         </w:rPr>
         <w:t xml:space="preserve">Приемлемый внешний вид. </w:t>
       </w:r>
@@ -2360,6 +2501,7 @@
         <w:rPr>
           <w:sz w:val="28"/>
           <w:szCs w:val="28"/>
+          <w:highlight w:val="yellow"/>
         </w:rPr>
         <w:t>css</w:t>
       </w:r>
@@ -2368,6 +2510,7 @@
         <w:rPr>
           <w:sz w:val="28"/>
           <w:szCs w:val="28"/>
+          <w:highlight w:val="yellow"/>
         </w:rPr>
         <w:t xml:space="preserve"> (</w:t>
       </w:r>
@@ -2375,6 +2518,7 @@
         <w:rPr>
           <w:sz w:val="28"/>
           <w:szCs w:val="28"/>
+          <w:highlight w:val="yellow"/>
         </w:rPr>
         <w:t>без</w:t>
       </w:r>
@@ -2382,15 +2526,17 @@
         <w:rPr>
           <w:sz w:val="28"/>
           <w:szCs w:val="28"/>
+          <w:highlight w:val="yellow"/>
         </w:rPr>
         <w:t xml:space="preserve"> </w:t>
       </w:r>
-      <w:hyperlink r:id="rId29" w:history="1">
+      <w:hyperlink r:id="rId24" w:history="1">
         <w:r>
           <w:rPr>
             <w:rStyle w:val="a6"/>
             <w:sz w:val="28"/>
             <w:szCs w:val="28"/>
+            <w:highlight w:val="yellow"/>
           </w:rPr>
           <w:t>https://www.bootstrapcdn.com/</w:t>
         </w:r>
@@ -2399,6 +2545,7 @@
         <w:rPr>
           <w:sz w:val="28"/>
           <w:szCs w:val="28"/>
+          <w:highlight w:val="yellow"/>
         </w:rPr>
         <w:t>)</w:t>
       </w:r>
@@ -2406,6 +2553,7 @@
         <w:rPr>
           <w:sz w:val="28"/>
           <w:szCs w:val="28"/>
+          <w:highlight w:val="yellow"/>
         </w:rPr>
         <w:t>;</w:t>
       </w:r>
@@ -2449,12 +2597,16 @@
         <w:rPr>
           <w:sz w:val="28"/>
           <w:szCs w:val="28"/>
-        </w:rPr>
-      </w:pPr>
-      <w:r>
-        <w:rPr>
-          <w:sz w:val="28"/>
-          <w:szCs w:val="28"/>
+          <w:highlight w:val="yellow"/>
+        </w:rPr>
+      </w:pPr>
+      <w:bookmarkStart w:id="0" w:name="_GoBack"/>
+      <w:bookmarkEnd w:id="0"/>
+      <w:r>
+        <w:rPr>
+          <w:sz w:val="28"/>
+          <w:szCs w:val="28"/>
+          <w:highlight w:val="yellow"/>
         </w:rPr>
         <w:lastRenderedPageBreak/>
         <w:t>Ограничить использование API проекта для неавторизованных запросов.</w:t>
@@ -2472,7 +2624,7 @@
 </file>
 
 <file path=word/numbering.xml><?xml version="1.0" encoding="utf-8"?>
-<w:numbering xmlns:wpc="http://schemas.microsoft.com/office/word/2010/wordprocessingCanvas" xmlns:mc="http://schemas.openxmlformats.org/markup-compatibility/2006" xmlns:o="urn:schemas-microsoft-com:office:office" xmlns:r="http://schemas.openxmlformats.org/officeDocument/2006/relationships" xmlns:m="http://schemas.openxmlformats.org/officeDocument/2006/math" xmlns:v="urn:schemas-microsoft-com:vml" xmlns:wp14="http://schemas.microsoft.com/office/word/2010/wordprocessingDrawing" xmlns:wp="http://schemas.openxmlformats.org/drawingml/2006/wordprocessingDrawing" xmlns:w10="urn:schemas-microsoft-com:office:word" xmlns:w="http://schemas.openxmlformats.org/wordprocessingml/2006/main" xmlns:w14="http://schemas.microsoft.com/office/word/2010/wordml" xmlns:w15="http://schemas.microsoft.com/office/word/2012/wordml" xmlns:wpg="http://schemas.microsoft.com/office/word/2010/wordprocessingGroup" xmlns:wpi="http://schemas.microsoft.com/office/word/2010/wordprocessingInk" xmlns:wne="http://schemas.microsoft.com/office/word/2006/wordml" xmlns:wps="http://schemas.microsoft.com/office/word/2010/wordprocessingShape" mc:Ignorable="w14 w15 wp14">
+<w:numbering xmlns:wpc="http://schemas.microsoft.com/office/word/2010/wordprocessingCanvas" xmlns:cx="http://schemas.microsoft.com/office/drawing/2014/chartex" xmlns:mc="http://schemas.openxmlformats.org/markup-compatibility/2006" xmlns:o="urn:schemas-microsoft-com:office:office" xmlns:r="http://schemas.openxmlformats.org/officeDocument/2006/relationships" xmlns:m="http://schemas.openxmlformats.org/officeDocument/2006/math" xmlns:v="urn:schemas-microsoft-com:vml" xmlns:wp14="http://schemas.microsoft.com/office/word/2010/wordprocessingDrawing" xmlns:wp="http://schemas.openxmlformats.org/drawingml/2006/wordprocessingDrawing" xmlns:w10="urn:schemas-microsoft-com:office:word" xmlns:w="http://schemas.openxmlformats.org/wordprocessingml/2006/main" xmlns:w14="http://schemas.microsoft.com/office/word/2010/wordml" xmlns:w15="http://schemas.microsoft.com/office/word/2012/wordml" xmlns:w16se="http://schemas.microsoft.com/office/word/2015/wordml/symex" xmlns:wpg="http://schemas.microsoft.com/office/word/2010/wordprocessingGroup" xmlns:wpi="http://schemas.microsoft.com/office/word/2010/wordprocessingInk" xmlns:wne="http://schemas.microsoft.com/office/word/2006/wordml" xmlns:wps="http://schemas.microsoft.com/office/word/2010/wordprocessingShape" mc:Ignorable="w14 w15 w16se wp14">
   <w:abstractNum w:abstractNumId="0" w15:restartNumberingAfterBreak="0">
     <w:nsid w:val="0BAF5BDD"/>
     <w:multiLevelType w:val="multilevel"/>
@@ -3476,7 +3628,7 @@
 </file>
 
 <file path=word/styles.xml><?xml version="1.0" encoding="utf-8"?>
-<w:styles xmlns:mc="http://schemas.openxmlformats.org/markup-compatibility/2006" xmlns:r="http://schemas.openxmlformats.org/officeDocument/2006/relationships" xmlns:w="http://schemas.openxmlformats.org/wordprocessingml/2006/main" xmlns:w14="http://schemas.microsoft.com/office/word/2010/wordml" xmlns:w15="http://schemas.microsoft.com/office/word/2012/wordml" mc:Ignorable="w14 w15">
+<w:styles xmlns:mc="http://schemas.openxmlformats.org/markup-compatibility/2006" xmlns:r="http://schemas.openxmlformats.org/officeDocument/2006/relationships" xmlns:w="http://schemas.openxmlformats.org/wordprocessingml/2006/main" xmlns:w14="http://schemas.microsoft.com/office/word/2010/wordml" xmlns:w15="http://schemas.microsoft.com/office/word/2012/wordml" xmlns:w16se="http://schemas.microsoft.com/office/word/2015/wordml/symex" mc:Ignorable="w14 w15 w16se">
   <w:docDefaults>
     <w:rPrDefault>
       <w:rPr>

</xml_diff>

<commit_message>
Create doctor component implemented. Doctor form is now a separated component
</commit_message>
<xml_diff>
--- a/STRWEB/LR4/LR4 СТРВП (1).docx
+++ b/STRWEB/LR4/LR4 СТРВП (1).docx
@@ -551,41 +551,527 @@
           <w:lang w:val="en-US"/>
         </w:rPr>
       </w:pPr>
-      <w:hyperlink r:id="rId11" w:history="1"/>
+      <w:r>
+        <w:fldChar w:fldCharType="begin"/>
+      </w:r>
+      <w:r>
+        <w:rPr>
+          <w:lang w:val="en-US"/>
+        </w:rPr>
+        <w:instrText xml:space="preserve"> HYPERLINK "https://metanit.com/web/react/?ysclid=loiov4ig95727252426" </w:instrText>
+      </w:r>
+      <w:r>
+        <w:fldChar w:fldCharType="separate"/>
+      </w:r>
+      <w:r>
+        <w:fldChar w:fldCharType="end"/>
+      </w:r>
+      <w:r>
+        <w:fldChar w:fldCharType="begin"/>
+      </w:r>
+      <w:r>
+        <w:rPr>
+          <w:lang w:val="en-US"/>
+        </w:rPr>
+        <w:instrText xml:space="preserve"> HYPERLINK "https://developer.mozilla.org/en-US/docs/Learn/Tools_and_te</w:instrText>
+      </w:r>
+      <w:r>
+        <w:rPr>
+          <w:lang w:val="en-US"/>
+        </w:rPr>
+        <w:instrText xml:space="preserve">sting/Client-side_JavaScript_frameworks/React_getting_started" </w:instrText>
+      </w:r>
+      <w:r>
+        <w:fldChar w:fldCharType="separate"/>
+      </w:r>
+      <w:r>
+        <w:rPr>
+          <w:rStyle w:val="a6"/>
+          <w:lang w:val="en-US"/>
+        </w:rPr>
+        <w:t>Getting started with React - Learn web development | MDN (mozilla.org)</w:t>
+      </w:r>
+      <w:r>
+        <w:rPr>
+          <w:rStyle w:val="a6"/>
+          <w:lang w:val="en-US"/>
+        </w:rPr>
+        <w:fldChar w:fldCharType="end"/>
+      </w:r>
+    </w:p>
+    <w:p>
+      <w:pPr>
+        <w:jc w:val="both"/>
+      </w:pPr>
+      <w:hyperlink r:id="rId11" w:history="1">
+        <w:r>
+          <w:rPr>
+            <w:rStyle w:val="a6"/>
+          </w:rPr>
+          <w:t xml:space="preserve">Быстрый старт  </w:t>
+        </w:r>
+        <w:proofErr w:type="spellStart"/>
+        <w:r>
+          <w:rPr>
+            <w:rStyle w:val="a6"/>
+          </w:rPr>
+          <w:t>React</w:t>
+        </w:r>
+        <w:proofErr w:type="spellEnd"/>
+        <w:r>
+          <w:rPr>
+            <w:rStyle w:val="a6"/>
+          </w:rPr>
+          <w:t xml:space="preserve"> с примерами кода (reactdev.ru)</w:t>
+        </w:r>
+      </w:hyperlink>
+    </w:p>
+    <w:p>
+      <w:pPr>
+        <w:jc w:val="both"/>
+        <w:rPr>
+          <w:lang w:val="en-US"/>
+        </w:rPr>
+      </w:pPr>
       <w:hyperlink r:id="rId12" w:history="1">
         <w:r>
           <w:rPr>
             <w:rStyle w:val="a6"/>
             <w:lang w:val="en-US"/>
           </w:rPr>
-          <w:t>Getting started with React - Learn web development | MDN (mozilla.org)</w:t>
+          <w:t>React Reference Overview – React</w:t>
         </w:r>
       </w:hyperlink>
     </w:p>
     <w:p>
       <w:pPr>
         <w:jc w:val="both"/>
+        <w:rPr>
+          <w:lang w:val="en-US"/>
+        </w:rPr>
       </w:pPr>
       <w:hyperlink r:id="rId13" w:history="1">
         <w:r>
           <w:rPr>
             <w:rStyle w:val="a6"/>
           </w:rPr>
-          <w:t xml:space="preserve">Быстрый старт  </w:t>
+          <w:t>Учебник</w:t>
+        </w:r>
+        <w:r>
+          <w:rPr>
+            <w:rStyle w:val="a6"/>
+            <w:lang w:val="en-US"/>
+          </w:rPr>
+          <w:t>. React</w:t>
+        </w:r>
+        <w:r>
+          <w:rPr>
+            <w:rStyle w:val="a6"/>
+            <w:lang w:val="en-US"/>
+          </w:rPr>
+          <w:t xml:space="preserve"> </w:t>
+        </w:r>
+        <w:r>
+          <w:rPr>
+            <w:rStyle w:val="a6"/>
+          </w:rPr>
+          <w:t>для</w:t>
+        </w:r>
+        <w:r>
+          <w:rPr>
+            <w:rStyle w:val="a6"/>
+            <w:lang w:val="en-US"/>
+          </w:rPr>
+          <w:t xml:space="preserve"> </w:t>
+        </w:r>
+        <w:r>
+          <w:rPr>
+            <w:rStyle w:val="a6"/>
+          </w:rPr>
+          <w:t>начинающих</w:t>
+        </w:r>
+        <w:r>
+          <w:rPr>
+            <w:rStyle w:val="a6"/>
+            <w:lang w:val="en-US"/>
+          </w:rPr>
+          <w:t xml:space="preserve"> | </w:t>
+        </w:r>
+        <w:r>
+          <w:rPr>
+            <w:rStyle w:val="a6"/>
+            <w:lang w:val="en-US"/>
+          </w:rPr>
+          <w:t>Microsoft</w:t>
+        </w:r>
+        <w:r>
+          <w:rPr>
+            <w:rStyle w:val="a6"/>
+            <w:lang w:val="en-US"/>
+          </w:rPr>
+          <w:t xml:space="preserve"> </w:t>
+        </w:r>
+        <w:r>
+          <w:rPr>
+            <w:rStyle w:val="a6"/>
+            <w:lang w:val="en-US"/>
+          </w:rPr>
+          <w:t>Learn</w:t>
+        </w:r>
+      </w:hyperlink>
+      <w:r>
+        <w:rPr>
+          <w:lang w:val="en-US"/>
+        </w:rPr>
+        <w:t xml:space="preserve"> </w:t>
+      </w:r>
+    </w:p>
+    <w:p>
+      <w:pPr>
+        <w:jc w:val="both"/>
+        <w:rPr>
+          <w:b/>
+          <w:sz w:val="28"/>
+          <w:szCs w:val="28"/>
+          <w:lang w:val="en-US"/>
+        </w:rPr>
+      </w:pPr>
+    </w:p>
+    <w:p>
+      <w:pPr>
+        <w:jc w:val="both"/>
+        <w:rPr>
+          <w:b/>
+          <w:sz w:val="28"/>
+          <w:szCs w:val="28"/>
+          <w:lang w:val="en-US"/>
+        </w:rPr>
+      </w:pPr>
+      <w:r>
+        <w:rPr>
+          <w:b/>
+          <w:sz w:val="28"/>
+          <w:szCs w:val="28"/>
+          <w:lang w:val="en-US"/>
+        </w:rPr>
+        <w:t>C</w:t>
+      </w:r>
+      <w:proofErr w:type="spellStart"/>
+      <w:r>
+        <w:rPr>
+          <w:b/>
+          <w:sz w:val="28"/>
+          <w:szCs w:val="28"/>
+        </w:rPr>
+        <w:t>правочная</w:t>
+      </w:r>
+      <w:proofErr w:type="spellEnd"/>
+      <w:r>
+        <w:rPr>
+          <w:b/>
+          <w:sz w:val="28"/>
+          <w:szCs w:val="28"/>
+          <w:lang w:val="en-US"/>
+        </w:rPr>
+        <w:t xml:space="preserve"> </w:t>
+      </w:r>
+      <w:r>
+        <w:rPr>
+          <w:b/>
+          <w:sz w:val="28"/>
+          <w:szCs w:val="28"/>
+        </w:rPr>
+        <w:t>информация</w:t>
+      </w:r>
+      <w:r>
+        <w:rPr>
+          <w:b/>
+          <w:sz w:val="28"/>
+          <w:szCs w:val="28"/>
+          <w:lang w:val="en-US"/>
+        </w:rPr>
+        <w:t xml:space="preserve"> </w:t>
+      </w:r>
+      <w:r>
+        <w:rPr>
+          <w:b/>
+          <w:sz w:val="28"/>
+          <w:szCs w:val="28"/>
+        </w:rPr>
+        <w:t>по</w:t>
+      </w:r>
+      <w:r>
+        <w:rPr>
+          <w:b/>
+          <w:sz w:val="28"/>
+          <w:szCs w:val="28"/>
+          <w:lang w:val="en-US"/>
+        </w:rPr>
+        <w:t xml:space="preserve"> </w:t>
+      </w:r>
+      <w:r>
+        <w:rPr>
+          <w:b/>
+          <w:sz w:val="28"/>
+          <w:szCs w:val="28"/>
+          <w:lang w:val="en-US"/>
+        </w:rPr>
+        <w:t>Node</w:t>
+      </w:r>
+      <w:r>
+        <w:rPr>
+          <w:b/>
+          <w:sz w:val="28"/>
+          <w:szCs w:val="28"/>
+          <w:lang w:val="en-US"/>
+        </w:rPr>
+        <w:t>.</w:t>
+      </w:r>
+      <w:r>
+        <w:rPr>
+          <w:b/>
+          <w:sz w:val="28"/>
+          <w:szCs w:val="28"/>
+          <w:lang w:val="en-US"/>
+        </w:rPr>
+        <w:t>js</w:t>
+      </w:r>
+      <w:r>
+        <w:rPr>
+          <w:b/>
+          <w:sz w:val="28"/>
+          <w:szCs w:val="28"/>
+          <w:lang w:val="en-US"/>
+        </w:rPr>
+        <w:t>/</w:t>
+      </w:r>
+      <w:r>
+        <w:rPr>
+          <w:sz w:val="28"/>
+          <w:szCs w:val="28"/>
+          <w:lang w:val="en-US"/>
+        </w:rPr>
+        <w:t xml:space="preserve"> </w:t>
+      </w:r>
+      <w:r>
+        <w:rPr>
+          <w:b/>
+          <w:sz w:val="28"/>
+          <w:szCs w:val="28"/>
+          <w:lang w:val="en-US"/>
+        </w:rPr>
+        <w:t>Express</w:t>
+      </w:r>
+      <w:r>
+        <w:rPr>
+          <w:b/>
+          <w:sz w:val="28"/>
+          <w:szCs w:val="28"/>
+          <w:lang w:val="en-US"/>
+        </w:rPr>
+        <w:t>:</w:t>
+      </w:r>
+    </w:p>
+    <w:p>
+      <w:pPr>
+        <w:jc w:val="both"/>
+        <w:rPr>
+          <w:lang w:val="en-US"/>
+        </w:rPr>
+      </w:pPr>
+      <w:hyperlink r:id="rId14" w:history="1">
+        <w:r>
+          <w:rPr>
+            <w:rStyle w:val="a6"/>
+            <w:lang w:val="en-US"/>
+          </w:rPr>
+          <w:t>https://developer.mozilla.org/ru/docs/Learn/Server-side/Express_Nodejs</w:t>
+        </w:r>
+      </w:hyperlink>
+      <w:r>
+        <w:rPr>
+          <w:lang w:val="en-US"/>
+        </w:rPr>
+        <w:t xml:space="preserve"> </w:t>
+      </w:r>
+    </w:p>
+    <w:p>
+      <w:pPr>
+        <w:jc w:val="both"/>
+        <w:rPr>
+          <w:lang w:val="en-US"/>
+        </w:rPr>
+      </w:pPr>
+      <w:hyperlink r:id="rId15" w:history="1">
+        <w:r>
+          <w:rPr>
+            <w:rStyle w:val="a6"/>
+            <w:lang w:val="en-US"/>
+          </w:rPr>
+          <w:t xml:space="preserve">Node.JS | </w:t>
+        </w:r>
+        <w:r>
+          <w:rPr>
+            <w:rStyle w:val="a6"/>
+          </w:rPr>
+          <w:t>Введение</w:t>
+        </w:r>
+        <w:r>
+          <w:rPr>
+            <w:rStyle w:val="a6"/>
+            <w:lang w:val="en-US"/>
+          </w:rPr>
+          <w:t xml:space="preserve"> </w:t>
+        </w:r>
+        <w:r>
+          <w:rPr>
+            <w:rStyle w:val="a6"/>
+          </w:rPr>
+          <w:t>и</w:t>
+        </w:r>
+        <w:r>
+          <w:rPr>
+            <w:rStyle w:val="a6"/>
+            <w:lang w:val="en-US"/>
+          </w:rPr>
+          <w:t xml:space="preserve"> </w:t>
+        </w:r>
+        <w:r>
+          <w:rPr>
+            <w:rStyle w:val="a6"/>
+          </w:rPr>
+          <w:t>начало</w:t>
+        </w:r>
+        <w:r>
+          <w:rPr>
+            <w:rStyle w:val="a6"/>
+            <w:lang w:val="en-US"/>
+          </w:rPr>
+          <w:t xml:space="preserve"> </w:t>
+        </w:r>
+        <w:r>
+          <w:rPr>
+            <w:rStyle w:val="a6"/>
+          </w:rPr>
+          <w:t>работы</w:t>
+        </w:r>
+        <w:r>
+          <w:rPr>
+            <w:rStyle w:val="a6"/>
+            <w:lang w:val="en-US"/>
+          </w:rPr>
+          <w:t xml:space="preserve"> (metanit.com)</w:t>
+        </w:r>
+      </w:hyperlink>
+      <w:r>
+        <w:rPr>
+          <w:lang w:val="en-US"/>
+        </w:rPr>
+        <w:t xml:space="preserve">      </w:t>
+      </w:r>
+      <w:hyperlink r:id="rId16" w:history="1">
+        <w:r>
+          <w:rPr>
+            <w:rStyle w:val="a6"/>
+            <w:lang w:val="en-US"/>
+          </w:rPr>
+          <w:t xml:space="preserve">Node.JS | </w:t>
+        </w:r>
+        <w:r>
+          <w:rPr>
+            <w:rStyle w:val="a6"/>
+          </w:rPr>
+          <w:t>Начало</w:t>
+        </w:r>
+        <w:r>
+          <w:rPr>
+            <w:rStyle w:val="a6"/>
+            <w:lang w:val="en-US"/>
+          </w:rPr>
+          <w:t xml:space="preserve"> </w:t>
+        </w:r>
+        <w:r>
+          <w:rPr>
+            <w:rStyle w:val="a6"/>
+          </w:rPr>
+          <w:t>работы</w:t>
+        </w:r>
+        <w:r>
+          <w:rPr>
+            <w:rStyle w:val="a6"/>
+            <w:lang w:val="en-US"/>
+          </w:rPr>
+          <w:t xml:space="preserve"> </w:t>
+        </w:r>
+        <w:r>
+          <w:rPr>
+            <w:rStyle w:val="a6"/>
+          </w:rPr>
+          <w:t>с</w:t>
+        </w:r>
+        <w:r>
+          <w:rPr>
+            <w:rStyle w:val="a6"/>
+            <w:lang w:val="en-US"/>
+          </w:rPr>
+          <w:t xml:space="preserve"> Express (metanit.com)</w:t>
+        </w:r>
+      </w:hyperlink>
+    </w:p>
+    <w:p>
+      <w:pPr>
+        <w:jc w:val="both"/>
+        <w:rPr>
+          <w:lang w:val="en-US"/>
+        </w:rPr>
+      </w:pPr>
+      <w:hyperlink r:id="rId17" w:history="1">
+        <w:r>
+          <w:rPr>
+            <w:rStyle w:val="a6"/>
+            <w:lang w:val="en-US"/>
+          </w:rPr>
+          <w:t>Guides | Node.js (nodejs.org)</w:t>
+        </w:r>
+      </w:hyperlink>
+    </w:p>
+    <w:p>
+      <w:pPr>
+        <w:jc w:val="both"/>
+      </w:pPr>
+      <w:hyperlink r:id="rId18" w:history="1">
+        <w:r>
+          <w:rPr>
+            <w:rStyle w:val="a6"/>
+          </w:rPr>
+          <w:t xml:space="preserve">Полное руководство по Node.js — Изучите </w:t>
         </w:r>
         <w:proofErr w:type="spellStart"/>
         <w:r>
           <w:rPr>
             <w:rStyle w:val="a6"/>
           </w:rPr>
-          <w:t>React</w:t>
+          <w:t>Node</w:t>
         </w:r>
         <w:proofErr w:type="spellEnd"/>
         <w:r>
           <w:rPr>
             <w:rStyle w:val="a6"/>
           </w:rPr>
-          <w:t xml:space="preserve"> с примерами кода (reactdev.ru)</w:t>
+          <w:t xml:space="preserve"> для начинающих </w:t>
+        </w:r>
+        <w:r>
+          <w:rPr>
+            <w:rStyle w:val="a6"/>
+            <w:rFonts w:ascii="Segoe UI Symbol" w:hAnsi="Segoe UI Symbol" w:cs="Segoe UI Symbol"/>
+          </w:rPr>
+          <w:t>⚡</w:t>
+        </w:r>
+        <w:r>
+          <w:rPr>
+            <w:rStyle w:val="a6"/>
+          </w:rPr>
+          <w:t>️ Node.js с примерами кода (nodejsdev.ru)</w:t>
         </w:r>
       </w:hyperlink>
     </w:p>
@@ -593,272 +1079,109 @@
       <w:pPr>
         <w:jc w:val="both"/>
         <w:rPr>
-          <w:lang w:val="en-US"/>
-        </w:rPr>
-      </w:pPr>
-      <w:r>
-        <w:fldChar w:fldCharType="begin"/>
-      </w:r>
-      <w:r>
-        <w:rPr>
-          <w:lang w:val="en-US"/>
-        </w:rPr>
-        <w:instrText xml:space="preserve"> HYPERLINK "https://reac</w:instrText>
-      </w:r>
-      <w:r>
-        <w:rPr>
-          <w:lang w:val="en-US"/>
-        </w:rPr>
-        <w:instrText xml:space="preserve">t.dev/reference/react" </w:instrText>
-      </w:r>
-      <w:r>
-        <w:fldChar w:fldCharType="separate"/>
-      </w:r>
-      <w:r>
-        <w:rPr>
-          <w:rStyle w:val="a6"/>
-          <w:lang w:val="en-US"/>
-        </w:rPr>
-        <w:t>React Reference Overview – React</w:t>
-      </w:r>
-      <w:r>
-        <w:rPr>
-          <w:rStyle w:val="a6"/>
-          <w:lang w:val="en-US"/>
-        </w:rPr>
-        <w:fldChar w:fldCharType="end"/>
-      </w:r>
+          <w:b/>
+        </w:rPr>
+      </w:pPr>
+      <w:hyperlink r:id="rId19" w:history="1">
+        <w:r>
+          <w:rPr>
+            <w:rStyle w:val="a6"/>
+          </w:rPr>
+          <w:t>Полный справочник по Node.js (questu.ru)</w:t>
+        </w:r>
+      </w:hyperlink>
     </w:p>
     <w:p>
       <w:pPr>
         <w:jc w:val="both"/>
         <w:rPr>
-          <w:lang w:val="en-US"/>
-        </w:rPr>
-      </w:pPr>
-      <w:r>
-        <w:fldChar w:fldCharType="begin"/>
-      </w:r>
-      <w:r>
-        <w:rPr>
-          <w:lang w:val="en-US"/>
-        </w:rPr>
-        <w:instrText xml:space="preserve"> HYPERLINK "https://learn.microsoft.com/ru-ru/windows/dev-environment/javascript/react-beginners-tutorial" </w:instrText>
-      </w:r>
-      <w:r>
-        <w:fldChar w:fldCharType="separate"/>
-      </w:r>
-      <w:r>
-        <w:rPr>
-          <w:rStyle w:val="a6"/>
-        </w:rPr>
-        <w:t>Учебник</w:t>
-      </w:r>
-      <w:r>
-        <w:rPr>
-          <w:rStyle w:val="a6"/>
-          <w:lang w:val="en-US"/>
-        </w:rPr>
-        <w:t>. React</w:t>
-      </w:r>
-      <w:r>
-        <w:rPr>
-          <w:rStyle w:val="a6"/>
-          <w:lang w:val="en-US"/>
+          <w:b/>
+          <w:sz w:val="28"/>
+          <w:szCs w:val="28"/>
+        </w:rPr>
+      </w:pPr>
+    </w:p>
+    <w:p>
+      <w:pPr>
+        <w:jc w:val="both"/>
+        <w:rPr>
+          <w:b/>
+          <w:sz w:val="28"/>
+          <w:szCs w:val="28"/>
+        </w:rPr>
+      </w:pPr>
+      <w:r>
+        <w:rPr>
+          <w:b/>
+          <w:sz w:val="28"/>
+          <w:szCs w:val="28"/>
+        </w:rPr>
+        <w:t xml:space="preserve">Задание. </w:t>
+      </w:r>
+    </w:p>
+    <w:p>
+      <w:pPr>
+        <w:jc w:val="both"/>
+        <w:rPr>
+          <w:sz w:val="28"/>
+          <w:szCs w:val="28"/>
+        </w:rPr>
+      </w:pPr>
+      <w:r>
+        <w:rPr>
+          <w:sz w:val="28"/>
+          <w:szCs w:val="28"/>
+        </w:rPr>
+        <w:t>Разработать</w:t>
+      </w:r>
+      <w:r>
+        <w:rPr>
+          <w:sz w:val="28"/>
+          <w:szCs w:val="28"/>
+        </w:rPr>
+        <w:t xml:space="preserve"> веб-сайт с использованием</w:t>
+      </w:r>
+      <w:r>
+        <w:rPr>
+          <w:sz w:val="28"/>
+          <w:szCs w:val="28"/>
         </w:rPr>
         <w:t xml:space="preserve"> </w:t>
       </w:r>
       <w:r>
         <w:rPr>
-          <w:rStyle w:val="a6"/>
-        </w:rPr>
-        <w:t>для</w:t>
-      </w:r>
-      <w:r>
-        <w:rPr>
-          <w:rStyle w:val="a6"/>
-          <w:lang w:val="en-US"/>
-        </w:rPr>
-        <w:t xml:space="preserve"> </w:t>
-      </w:r>
-      <w:r>
-        <w:rPr>
-          <w:rStyle w:val="a6"/>
-        </w:rPr>
-        <w:t>начинающих</w:t>
-      </w:r>
-      <w:r>
-        <w:rPr>
-          <w:rStyle w:val="a6"/>
-          <w:lang w:val="en-US"/>
-        </w:rPr>
-        <w:t xml:space="preserve"> | </w:t>
-      </w:r>
-      <w:r>
-        <w:rPr>
-          <w:rStyle w:val="a6"/>
-          <w:lang w:val="en-US"/>
-        </w:rPr>
-        <w:t>Microsoft</w:t>
-      </w:r>
-      <w:r>
-        <w:rPr>
-          <w:rStyle w:val="a6"/>
-          <w:lang w:val="en-US"/>
-        </w:rPr>
-        <w:t xml:space="preserve"> </w:t>
-      </w:r>
-      <w:r>
-        <w:rPr>
-          <w:rStyle w:val="a6"/>
-          <w:lang w:val="en-US"/>
-        </w:rPr>
-        <w:t>Learn</w:t>
-      </w:r>
-      <w:r>
-        <w:rPr>
-          <w:rStyle w:val="a6"/>
-          <w:lang w:val="en-US"/>
-        </w:rPr>
-        <w:fldChar w:fldCharType="end"/>
-      </w:r>
-      <w:r>
-        <w:rPr>
-          <w:lang w:val="en-US"/>
-        </w:rPr>
-        <w:t xml:space="preserve"> </w:t>
-      </w:r>
-    </w:p>
-    <w:p>
-      <w:pPr>
-        <w:jc w:val="both"/>
-        <w:rPr>
-          <w:b/>
-          <w:sz w:val="28"/>
-          <w:szCs w:val="28"/>
-          <w:lang w:val="en-US"/>
-        </w:rPr>
-      </w:pPr>
-    </w:p>
-    <w:p>
-      <w:pPr>
-        <w:jc w:val="both"/>
-        <w:rPr>
-          <w:b/>
-          <w:sz w:val="28"/>
-          <w:szCs w:val="28"/>
-          <w:lang w:val="en-US"/>
-        </w:rPr>
-      </w:pPr>
-      <w:r>
-        <w:rPr>
-          <w:b/>
-          <w:sz w:val="28"/>
-          <w:szCs w:val="28"/>
-          <w:lang w:val="en-US"/>
-        </w:rPr>
-        <w:t>C</w:t>
+          <w:sz w:val="28"/>
+          <w:szCs w:val="28"/>
+          <w:lang w:val="en-US"/>
+        </w:rPr>
+        <w:t>Node</w:t>
+      </w:r>
+      <w:r>
+        <w:rPr>
+          <w:sz w:val="28"/>
+          <w:szCs w:val="28"/>
+        </w:rPr>
+        <w:t>.</w:t>
       </w:r>
       <w:proofErr w:type="spellStart"/>
       <w:r>
         <w:rPr>
-          <w:b/>
-          <w:sz w:val="28"/>
-          <w:szCs w:val="28"/>
-        </w:rPr>
-        <w:t>правочная</w:t>
+          <w:sz w:val="28"/>
+          <w:szCs w:val="28"/>
+          <w:lang w:val="en-US"/>
+        </w:rPr>
+        <w:t>js</w:t>
       </w:r>
       <w:proofErr w:type="spellEnd"/>
       <w:r>
         <w:rPr>
-          <w:b/>
-          <w:sz w:val="28"/>
-          <w:szCs w:val="28"/>
-          <w:lang w:val="en-US"/>
-        </w:rPr>
-        <w:t xml:space="preserve"> </w:t>
-      </w:r>
-      <w:r>
-        <w:rPr>
-          <w:b/>
-          <w:sz w:val="28"/>
-          <w:szCs w:val="28"/>
-        </w:rPr>
-        <w:t>информация</w:t>
-      </w:r>
-      <w:r>
-        <w:rPr>
-          <w:b/>
-          <w:sz w:val="28"/>
-          <w:szCs w:val="28"/>
-          <w:lang w:val="en-US"/>
-        </w:rPr>
-        <w:t xml:space="preserve"> </w:t>
-      </w:r>
-      <w:r>
-        <w:rPr>
-          <w:b/>
-          <w:sz w:val="28"/>
-          <w:szCs w:val="28"/>
-        </w:rPr>
-        <w:t>по</w:t>
-      </w:r>
-      <w:r>
-        <w:rPr>
-          <w:b/>
-          <w:sz w:val="28"/>
-          <w:szCs w:val="28"/>
-          <w:lang w:val="en-US"/>
-        </w:rPr>
-        <w:t xml:space="preserve"> </w:t>
-      </w:r>
-      <w:r>
-        <w:rPr>
-          <w:b/>
-          <w:sz w:val="28"/>
-          <w:szCs w:val="28"/>
-          <w:lang w:val="en-US"/>
-        </w:rPr>
-        <w:t>Node</w:t>
-      </w:r>
-      <w:r>
-        <w:rPr>
-          <w:b/>
-          <w:sz w:val="28"/>
-          <w:szCs w:val="28"/>
-          <w:lang w:val="en-US"/>
-        </w:rPr>
-        <w:t>.</w:t>
-      </w:r>
-      <w:r>
-        <w:rPr>
-          <w:b/>
-          <w:sz w:val="28"/>
-          <w:szCs w:val="28"/>
-          <w:lang w:val="en-US"/>
-        </w:rPr>
-        <w:t>js</w:t>
-      </w:r>
-      <w:r>
-        <w:rPr>
-          <w:b/>
-          <w:sz w:val="28"/>
-          <w:szCs w:val="28"/>
-          <w:lang w:val="en-US"/>
-        </w:rPr>
-        <w:t>/</w:t>
-      </w:r>
-      <w:r>
-        <w:rPr>
-          <w:sz w:val="28"/>
-          <w:szCs w:val="28"/>
-          <w:lang w:val="en-US"/>
-        </w:rPr>
-        <w:t xml:space="preserve"> </w:t>
-      </w:r>
-      <w:r>
-        <w:rPr>
-          <w:b/>
+          <w:sz w:val="28"/>
+          <w:szCs w:val="28"/>
+        </w:rPr>
+        <w:t>(</w:t>
+      </w:r>
+      <w:r>
+        <w:rPr>
           <w:sz w:val="28"/>
           <w:szCs w:val="28"/>
           <w:lang w:val="en-US"/>
@@ -867,400 +1190,6 @@
       </w:r>
       <w:r>
         <w:rPr>
-          <w:b/>
-          <w:sz w:val="28"/>
-          <w:szCs w:val="28"/>
-          <w:lang w:val="en-US"/>
-        </w:rPr>
-        <w:t>:</w:t>
-      </w:r>
-    </w:p>
-    <w:p>
-      <w:pPr>
-        <w:jc w:val="both"/>
-        <w:rPr>
-          <w:lang w:val="en-US"/>
-        </w:rPr>
-      </w:pPr>
-      <w:r>
-        <w:fldChar w:fldCharType="begin"/>
-      </w:r>
-      <w:r>
-        <w:rPr>
-          <w:lang w:val="en-US"/>
-        </w:rPr>
-        <w:instrText xml:space="preserve"> HYPERLINK "https://developer.mozilla.org/ru/docs/Learn/Server-side/Express_Nodejs" </w:instrText>
-      </w:r>
-      <w:r>
-        <w:fldChar w:fldCharType="separate"/>
-      </w:r>
-      <w:r>
-        <w:rPr>
-          <w:rStyle w:val="a6"/>
-          <w:lang w:val="en-US"/>
-        </w:rPr>
-        <w:t>https://developer.mozilla.org/ru/docs/Learn/Server-side/Express_Nodejs</w:t>
-      </w:r>
-      <w:r>
-        <w:rPr>
-          <w:rStyle w:val="a6"/>
-          <w:lang w:val="en-US"/>
-        </w:rPr>
-        <w:fldChar w:fldCharType="end"/>
-      </w:r>
-      <w:r>
-        <w:rPr>
-          <w:lang w:val="en-US"/>
-        </w:rPr>
-        <w:t xml:space="preserve"> </w:t>
-      </w:r>
-    </w:p>
-    <w:p>
-      <w:pPr>
-        <w:jc w:val="both"/>
-        <w:rPr>
-          <w:lang w:val="en-US"/>
-        </w:rPr>
-      </w:pPr>
-      <w:r>
-        <w:fldChar w:fldCharType="begin"/>
-      </w:r>
-      <w:r>
-        <w:rPr>
-          <w:lang w:val="en-US"/>
-        </w:rPr>
-        <w:instrText xml:space="preserve"> HYPERLINK "https://metanit.com/web/nodejs/1.1.php" </w:instrText>
-      </w:r>
-      <w:r>
-        <w:fldChar w:fldCharType="separate"/>
-      </w:r>
-      <w:r>
-        <w:rPr>
-          <w:rStyle w:val="a6"/>
-          <w:lang w:val="en-US"/>
-        </w:rPr>
-        <w:t xml:space="preserve">Node.JS | </w:t>
-      </w:r>
-      <w:r>
-        <w:rPr>
-          <w:rStyle w:val="a6"/>
-        </w:rPr>
-        <w:t>Введение</w:t>
-      </w:r>
-      <w:r>
-        <w:rPr>
-          <w:rStyle w:val="a6"/>
-          <w:lang w:val="en-US"/>
-        </w:rPr>
-        <w:t xml:space="preserve"> </w:t>
-      </w:r>
-      <w:r>
-        <w:rPr>
-          <w:rStyle w:val="a6"/>
-        </w:rPr>
-        <w:t>и</w:t>
-      </w:r>
-      <w:r>
-        <w:rPr>
-          <w:rStyle w:val="a6"/>
-          <w:lang w:val="en-US"/>
-        </w:rPr>
-        <w:t xml:space="preserve"> </w:t>
-      </w:r>
-      <w:r>
-        <w:rPr>
-          <w:rStyle w:val="a6"/>
-        </w:rPr>
-        <w:t>начало</w:t>
-      </w:r>
-      <w:r>
-        <w:rPr>
-          <w:rStyle w:val="a6"/>
-          <w:lang w:val="en-US"/>
-        </w:rPr>
-        <w:t xml:space="preserve"> </w:t>
-      </w:r>
-      <w:r>
-        <w:rPr>
-          <w:rStyle w:val="a6"/>
-        </w:rPr>
-        <w:t>работы</w:t>
-      </w:r>
-      <w:r>
-        <w:rPr>
-          <w:rStyle w:val="a6"/>
-          <w:lang w:val="en-US"/>
-        </w:rPr>
-        <w:t xml:space="preserve"> (metanit.com)</w:t>
-      </w:r>
-      <w:r>
-        <w:rPr>
-          <w:rStyle w:val="a6"/>
-          <w:lang w:val="en-US"/>
-        </w:rPr>
-        <w:fldChar w:fldCharType="end"/>
-      </w:r>
-      <w:r>
-        <w:rPr>
-          <w:lang w:val="en-US"/>
-        </w:rPr>
-        <w:t xml:space="preserve">      </w:t>
-      </w:r>
-      <w:r>
-        <w:fldChar w:fldCharType="begin"/>
-      </w:r>
-      <w:r>
-        <w:rPr>
-          <w:lang w:val="en-US"/>
-        </w:rPr>
-        <w:instrText xml:space="preserve"> HYPERLINK "https://metanit.com/web/nodejs/4.1.php" </w:instrText>
-      </w:r>
-      <w:r>
-        <w:fldChar w:fldCharType="separate"/>
-      </w:r>
-      <w:r>
-        <w:rPr>
-          <w:rStyle w:val="a6"/>
-          <w:lang w:val="en-US"/>
-        </w:rPr>
-        <w:t xml:space="preserve">Node.JS | </w:t>
-      </w:r>
-      <w:r>
-        <w:rPr>
-          <w:rStyle w:val="a6"/>
-        </w:rPr>
-        <w:t>Начало</w:t>
-      </w:r>
-      <w:r>
-        <w:rPr>
-          <w:rStyle w:val="a6"/>
-          <w:lang w:val="en-US"/>
-        </w:rPr>
-        <w:t xml:space="preserve"> </w:t>
-      </w:r>
-      <w:r>
-        <w:rPr>
-          <w:rStyle w:val="a6"/>
-        </w:rPr>
-        <w:t>работы</w:t>
-      </w:r>
-      <w:r>
-        <w:rPr>
-          <w:rStyle w:val="a6"/>
-          <w:lang w:val="en-US"/>
-        </w:rPr>
-        <w:t xml:space="preserve"> </w:t>
-      </w:r>
-      <w:r>
-        <w:rPr>
-          <w:rStyle w:val="a6"/>
-        </w:rPr>
-        <w:t>с</w:t>
-      </w:r>
-      <w:r>
-        <w:rPr>
-          <w:rStyle w:val="a6"/>
-          <w:lang w:val="en-US"/>
-        </w:rPr>
-        <w:t xml:space="preserve"> Express (metanit.com)</w:t>
-      </w:r>
-      <w:r>
-        <w:rPr>
-          <w:rStyle w:val="a6"/>
-          <w:lang w:val="en-US"/>
-        </w:rPr>
-        <w:fldChar w:fldCharType="end"/>
-      </w:r>
-    </w:p>
-    <w:p>
-      <w:pPr>
-        <w:jc w:val="both"/>
-        <w:rPr>
-          <w:lang w:val="en-US"/>
-        </w:rPr>
-      </w:pPr>
-      <w:r>
-        <w:fldChar w:fldCharType="begin"/>
-      </w:r>
-      <w:r>
-        <w:rPr>
-          <w:lang w:val="en-US"/>
-        </w:rPr>
-        <w:instrText xml:space="preserve"> HYPERLINK "https://direct.nodejs.org/en/docs/guides" </w:instrText>
-      </w:r>
-      <w:r>
-        <w:fldChar w:fldCharType="separate"/>
-      </w:r>
-      <w:r>
-        <w:rPr>
-          <w:rStyle w:val="a6"/>
-          <w:lang w:val="en-US"/>
-        </w:rPr>
-        <w:t>Guides | Node.js (nodejs.org)</w:t>
-      </w:r>
-      <w:r>
-        <w:rPr>
-          <w:rStyle w:val="a6"/>
-          <w:lang w:val="en-US"/>
-        </w:rPr>
-        <w:fldChar w:fldCharType="end"/>
-      </w:r>
-    </w:p>
-    <w:p>
-      <w:pPr>
-        <w:jc w:val="both"/>
-      </w:pPr>
-      <w:hyperlink r:id="rId14" w:history="1">
-        <w:r>
-          <w:rPr>
-            <w:rStyle w:val="a6"/>
-          </w:rPr>
-          <w:t xml:space="preserve">Полное руководство по Node.js — Изучите </w:t>
-        </w:r>
-        <w:proofErr w:type="spellStart"/>
-        <w:r>
-          <w:rPr>
-            <w:rStyle w:val="a6"/>
-          </w:rPr>
-          <w:t>Node</w:t>
-        </w:r>
-        <w:proofErr w:type="spellEnd"/>
-        <w:r>
-          <w:rPr>
-            <w:rStyle w:val="a6"/>
-          </w:rPr>
-          <w:t xml:space="preserve"> для начинающих </w:t>
-        </w:r>
-        <w:r>
-          <w:rPr>
-            <w:rStyle w:val="a6"/>
-            <w:rFonts w:ascii="Segoe UI Symbol" w:hAnsi="Segoe UI Symbol" w:cs="Segoe UI Symbol"/>
-          </w:rPr>
-          <w:t>⚡</w:t>
-        </w:r>
-        <w:r>
-          <w:rPr>
-            <w:rStyle w:val="a6"/>
-          </w:rPr>
-          <w:t>️ Node.js с примерами кода (nodejsdev.ru)</w:t>
-        </w:r>
-      </w:hyperlink>
-    </w:p>
-    <w:p>
-      <w:pPr>
-        <w:jc w:val="both"/>
-        <w:rPr>
-          <w:b/>
-        </w:rPr>
-      </w:pPr>
-      <w:hyperlink r:id="rId15" w:history="1">
-        <w:r>
-          <w:rPr>
-            <w:rStyle w:val="a6"/>
-          </w:rPr>
-          <w:t>Полный справочник по Node.js (questu.ru)</w:t>
-        </w:r>
-      </w:hyperlink>
-    </w:p>
-    <w:p>
-      <w:pPr>
-        <w:jc w:val="both"/>
-        <w:rPr>
-          <w:b/>
-          <w:sz w:val="28"/>
-          <w:szCs w:val="28"/>
-        </w:rPr>
-      </w:pPr>
-    </w:p>
-    <w:p>
-      <w:pPr>
-        <w:jc w:val="both"/>
-        <w:rPr>
-          <w:b/>
-          <w:sz w:val="28"/>
-          <w:szCs w:val="28"/>
-        </w:rPr>
-      </w:pPr>
-      <w:r>
-        <w:rPr>
-          <w:b/>
-          <w:sz w:val="28"/>
-          <w:szCs w:val="28"/>
-        </w:rPr>
-        <w:t xml:space="preserve">Задание. </w:t>
-      </w:r>
-    </w:p>
-    <w:p>
-      <w:pPr>
-        <w:jc w:val="both"/>
-        <w:rPr>
-          <w:sz w:val="28"/>
-          <w:szCs w:val="28"/>
-        </w:rPr>
-      </w:pPr>
-      <w:r>
-        <w:rPr>
-          <w:sz w:val="28"/>
-          <w:szCs w:val="28"/>
-        </w:rPr>
-        <w:t>Разработать</w:t>
-      </w:r>
-      <w:r>
-        <w:rPr>
-          <w:sz w:val="28"/>
-          <w:szCs w:val="28"/>
-        </w:rPr>
-        <w:t xml:space="preserve"> веб-сайт с использованием</w:t>
-      </w:r>
-      <w:r>
-        <w:rPr>
-          <w:sz w:val="28"/>
-          <w:szCs w:val="28"/>
-        </w:rPr>
-        <w:t xml:space="preserve"> </w:t>
-      </w:r>
-      <w:r>
-        <w:rPr>
-          <w:sz w:val="28"/>
-          <w:szCs w:val="28"/>
-          <w:lang w:val="en-US"/>
-        </w:rPr>
-        <w:t>Node</w:t>
-      </w:r>
-      <w:r>
-        <w:rPr>
-          <w:sz w:val="28"/>
-          <w:szCs w:val="28"/>
-        </w:rPr>
-        <w:t>.</w:t>
-      </w:r>
-      <w:proofErr w:type="spellStart"/>
-      <w:r>
-        <w:rPr>
-          <w:sz w:val="28"/>
-          <w:szCs w:val="28"/>
-          <w:lang w:val="en-US"/>
-        </w:rPr>
-        <w:t>js</w:t>
-      </w:r>
-      <w:proofErr w:type="spellEnd"/>
-      <w:r>
-        <w:rPr>
-          <w:sz w:val="28"/>
-          <w:szCs w:val="28"/>
-        </w:rPr>
-        <w:t>(</w:t>
-      </w:r>
-      <w:r>
-        <w:rPr>
-          <w:sz w:val="28"/>
-          <w:szCs w:val="28"/>
-          <w:lang w:val="en-US"/>
-        </w:rPr>
-        <w:t>Express</w:t>
-      </w:r>
-      <w:r>
-        <w:rPr>
           <w:sz w:val="28"/>
           <w:szCs w:val="28"/>
         </w:rPr>
@@ -1280,7 +1209,7 @@
         </w:rPr>
         <w:t xml:space="preserve">сервера и </w:t>
       </w:r>
-      <w:hyperlink r:id="rId16" w:tgtFrame="_blank" w:history="1">
+      <w:hyperlink r:id="rId20" w:tgtFrame="_blank" w:history="1">
         <w:r>
           <w:rPr>
             <w:sz w:val="28"/>
@@ -1448,7 +1377,7 @@
         </w:rPr>
         <w:t>(</w:t>
       </w:r>
-      <w:hyperlink r:id="rId17" w:history="1">
+      <w:hyperlink r:id="rId21" w:history="1">
         <w:r>
           <w:rPr>
             <w:rStyle w:val="a6"/>
@@ -1467,7 +1396,7 @@
         </w:rPr>
         <w:t xml:space="preserve">, </w:t>
       </w:r>
-      <w:hyperlink r:id="rId18" w:history="1">
+      <w:hyperlink r:id="rId22" w:history="1">
         <w:r>
           <w:rPr>
             <w:rStyle w:val="a6"/>
@@ -1607,7 +1536,7 @@
         </w:rPr>
         <w:t xml:space="preserve"> (</w:t>
       </w:r>
-      <w:hyperlink r:id="rId19" w:history="1">
+      <w:hyperlink r:id="rId23" w:history="1">
         <w:r>
           <w:rPr>
             <w:rStyle w:val="a6"/>
@@ -1677,11 +1606,12 @@
           <w:szCs w:val="28"/>
         </w:rPr>
       </w:pPr>
-      <w:r>
-        <w:rPr>
-          <w:sz w:val="28"/>
-          <w:szCs w:val="28"/>
-          <w:highlight w:val="yellow"/>
+      <w:bookmarkStart w:id="0" w:name="_GoBack"/>
+      <w:bookmarkEnd w:id="0"/>
+      <w:r>
+        <w:rPr>
+          <w:sz w:val="28"/>
+          <w:szCs w:val="28"/>
         </w:rPr>
         <w:t>Для авторизованного юзера р</w:t>
       </w:r>
@@ -1689,7 +1619,6 @@
         <w:rPr>
           <w:sz w:val="28"/>
           <w:szCs w:val="28"/>
-          <w:highlight w:val="yellow"/>
         </w:rPr>
         <w:t xml:space="preserve">еализовать </w:t>
       </w:r>
@@ -1697,7 +1626,6 @@
         <w:rPr>
           <w:sz w:val="28"/>
           <w:szCs w:val="28"/>
-          <w:highlight w:val="yellow"/>
           <w:lang w:val="en-US"/>
         </w:rPr>
         <w:t>CRUD</w:t>
@@ -1706,7 +1634,6 @@
         <w:rPr>
           <w:sz w:val="28"/>
           <w:szCs w:val="28"/>
-          <w:highlight w:val="yellow"/>
         </w:rPr>
         <w:t xml:space="preserve"> (</w:t>
       </w:r>
@@ -1714,7 +1641,6 @@
         <w:rPr>
           <w:sz w:val="28"/>
           <w:szCs w:val="28"/>
-          <w:highlight w:val="yellow"/>
           <w:lang w:val="en-US"/>
         </w:rPr>
         <w:t>create</w:t>
@@ -1723,7 +1649,6 @@
         <w:rPr>
           <w:sz w:val="28"/>
           <w:szCs w:val="28"/>
-          <w:highlight w:val="yellow"/>
         </w:rPr>
         <w:t xml:space="preserve">, </w:t>
       </w:r>
@@ -1731,7 +1656,6 @@
         <w:rPr>
           <w:sz w:val="28"/>
           <w:szCs w:val="28"/>
-          <w:highlight w:val="yellow"/>
           <w:lang w:val="en-US"/>
         </w:rPr>
         <w:t>read</w:t>
@@ -1740,7 +1664,6 @@
         <w:rPr>
           <w:sz w:val="28"/>
           <w:szCs w:val="28"/>
-          <w:highlight w:val="yellow"/>
         </w:rPr>
         <w:t xml:space="preserve">, </w:t>
       </w:r>
@@ -1748,7 +1671,6 @@
         <w:rPr>
           <w:sz w:val="28"/>
           <w:szCs w:val="28"/>
-          <w:highlight w:val="yellow"/>
           <w:lang w:val="en-US"/>
         </w:rPr>
         <w:t>update</w:t>
@@ -1757,7 +1679,6 @@
         <w:rPr>
           <w:sz w:val="28"/>
           <w:szCs w:val="28"/>
-          <w:highlight w:val="yellow"/>
         </w:rPr>
         <w:t xml:space="preserve">, </w:t>
       </w:r>
@@ -1765,7 +1686,6 @@
         <w:rPr>
           <w:sz w:val="28"/>
           <w:szCs w:val="28"/>
-          <w:highlight w:val="yellow"/>
           <w:lang w:val="en-US"/>
         </w:rPr>
         <w:t>delete</w:t>
@@ -1774,7 +1694,6 @@
         <w:rPr>
           <w:sz w:val="28"/>
           <w:szCs w:val="28"/>
-          <w:highlight w:val="yellow"/>
         </w:rPr>
         <w:t xml:space="preserve">) операции </w:t>
       </w:r>
@@ -1782,7 +1701,6 @@
         <w:rPr>
           <w:sz w:val="28"/>
           <w:szCs w:val="28"/>
-          <w:highlight w:val="yellow"/>
         </w:rPr>
         <w:t>и возможность поиска</w:t>
       </w:r>
@@ -1790,7 +1708,6 @@
         <w:rPr>
           <w:sz w:val="28"/>
           <w:szCs w:val="28"/>
-          <w:highlight w:val="yellow"/>
         </w:rPr>
         <w:t>,</w:t>
       </w:r>
@@ -1808,7 +1725,7 @@
         </w:rPr>
         <w:t xml:space="preserve"> записей </w:t>
       </w:r>
-      <w:hyperlink r:id="rId20" w:history="1">
+      <w:hyperlink r:id="rId24" w:history="1">
         <w:r>
           <w:rPr>
             <w:rStyle w:val="a6"/>
@@ -1836,6 +1753,7 @@
         <w:rPr>
           <w:sz w:val="28"/>
           <w:szCs w:val="28"/>
+          <w:highlight w:val="yellow"/>
         </w:rPr>
         <w:t xml:space="preserve">Использовать формы, созданные с использованием </w:t>
       </w:r>
@@ -1843,6 +1761,7 @@
         <w:rPr>
           <w:sz w:val="28"/>
           <w:szCs w:val="28"/>
+          <w:highlight w:val="yellow"/>
           <w:lang w:val="en-US"/>
         </w:rPr>
         <w:t>React</w:t>
@@ -1851,6 +1770,7 @@
         <w:rPr>
           <w:sz w:val="28"/>
           <w:szCs w:val="28"/>
+          <w:highlight w:val="yellow"/>
         </w:rPr>
         <w:t>, для добавления записей.</w:t>
       </w:r>
@@ -1858,15 +1778,17 @@
         <w:rPr>
           <w:sz w:val="28"/>
           <w:szCs w:val="28"/>
+          <w:highlight w:val="yellow"/>
         </w:rPr>
         <w:t xml:space="preserve">  </w:t>
       </w:r>
-      <w:hyperlink r:id="rId21" w:history="1">
+      <w:hyperlink r:id="rId25" w:history="1">
         <w:r>
           <w:rPr>
             <w:rStyle w:val="a6"/>
             <w:sz w:val="28"/>
             <w:szCs w:val="28"/>
+            <w:highlight w:val="yellow"/>
           </w:rPr>
           <w:t>https://metanit.com/web/react/3.3.php</w:t>
         </w:r>
@@ -1924,6 +1846,7 @@
         <w:rPr>
           <w:sz w:val="28"/>
           <w:szCs w:val="28"/>
+          <w:highlight w:val="yellow"/>
         </w:rPr>
         <w:t>Обеспечить наполнение данными для демонстрации не менее 10 записей в списке товаров/услуг/объектов/клиентов</w:t>
       </w:r>
@@ -1931,6 +1854,7 @@
         <w:rPr>
           <w:sz w:val="28"/>
           <w:szCs w:val="28"/>
+          <w:highlight w:val="yellow"/>
         </w:rPr>
         <w:t>.</w:t>
       </w:r>
@@ -2023,12 +1947,14 @@
         <w:rPr>
           <w:sz w:val="28"/>
           <w:szCs w:val="28"/>
-        </w:rPr>
-      </w:pPr>
-      <w:r>
-        <w:rPr>
-          <w:sz w:val="28"/>
-          <w:szCs w:val="28"/>
+          <w:highlight w:val="yellow"/>
+        </w:rPr>
+      </w:pPr>
+      <w:r>
+        <w:rPr>
+          <w:sz w:val="28"/>
+          <w:szCs w:val="28"/>
+          <w:highlight w:val="yellow"/>
         </w:rPr>
         <w:t>Для создания всех</w:t>
       </w:r>
@@ -2037,6 +1963,7 @@
           <w:b/>
           <w:sz w:val="28"/>
           <w:szCs w:val="28"/>
+          <w:highlight w:val="yellow"/>
         </w:rPr>
         <w:t xml:space="preserve"> страниц (минимум </w:t>
       </w:r>
@@ -2045,6 +1972,7 @@
           <w:b/>
           <w:sz w:val="28"/>
           <w:szCs w:val="28"/>
+          <w:highlight w:val="yellow"/>
         </w:rPr>
         <w:t xml:space="preserve">четыре – выбрать любые из предыдущих </w:t>
       </w:r>
@@ -2054,6 +1982,7 @@
           <w:b/>
           <w:sz w:val="28"/>
           <w:szCs w:val="28"/>
+          <w:highlight w:val="yellow"/>
         </w:rPr>
         <w:t>ЛР</w:t>
       </w:r>
@@ -2062,6 +1991,7 @@
           <w:b/>
           <w:sz w:val="28"/>
           <w:szCs w:val="28"/>
+          <w:highlight w:val="yellow"/>
         </w:rPr>
         <w:t>(</w:t>
       </w:r>
@@ -2070,6 +2000,7 @@
         <w:rPr>
           <w:sz w:val="28"/>
           <w:szCs w:val="28"/>
+          <w:highlight w:val="yellow"/>
         </w:rPr>
         <w:t>среди страниц обязательно должен быть каталог, просмотр инфо об объекте из каталога</w:t>
       </w:r>
@@ -2078,6 +2009,7 @@
           <w:b/>
           <w:sz w:val="28"/>
           <w:szCs w:val="28"/>
+          <w:highlight w:val="yellow"/>
         </w:rPr>
         <w:t>), переключение между ними с помощью панели навигации</w:t>
       </w:r>
@@ -2086,6 +2018,7 @@
           <w:b/>
           <w:sz w:val="28"/>
           <w:szCs w:val="28"/>
+          <w:highlight w:val="yellow"/>
         </w:rPr>
         <w:t>)</w:t>
       </w:r>
@@ -2093,6 +2026,7 @@
         <w:rPr>
           <w:sz w:val="28"/>
           <w:szCs w:val="28"/>
+          <w:highlight w:val="yellow"/>
         </w:rPr>
         <w:t xml:space="preserve"> использовать только</w:t>
       </w:r>
@@ -2100,6 +2034,7 @@
         <w:rPr>
           <w:sz w:val="28"/>
           <w:szCs w:val="28"/>
+          <w:highlight w:val="yellow"/>
         </w:rPr>
         <w:t xml:space="preserve"> </w:t>
       </w:r>
@@ -2107,6 +2042,7 @@
         <w:rPr>
           <w:sz w:val="28"/>
           <w:szCs w:val="28"/>
+          <w:highlight w:val="yellow"/>
           <w:lang w:val="en-US"/>
         </w:rPr>
         <w:t>React</w:t>
@@ -2115,6 +2051,7 @@
         <w:rPr>
           <w:sz w:val="28"/>
           <w:szCs w:val="28"/>
+          <w:highlight w:val="yellow"/>
         </w:rPr>
         <w:t xml:space="preserve">. </w:t>
       </w:r>
@@ -2129,12 +2066,14 @@
         <w:rPr>
           <w:sz w:val="28"/>
           <w:szCs w:val="28"/>
-        </w:rPr>
-      </w:pPr>
-      <w:r>
-        <w:rPr>
-          <w:sz w:val="28"/>
-          <w:szCs w:val="28"/>
+          <w:highlight w:val="yellow"/>
+        </w:rPr>
+      </w:pPr>
+      <w:r>
+        <w:rPr>
+          <w:sz w:val="28"/>
+          <w:szCs w:val="28"/>
+          <w:highlight w:val="yellow"/>
         </w:rPr>
         <w:t xml:space="preserve">Создать компоненты </w:t>
       </w:r>
@@ -2149,12 +2088,14 @@
         <w:rPr>
           <w:sz w:val="28"/>
           <w:szCs w:val="28"/>
-        </w:rPr>
-      </w:pPr>
-      <w:r>
-        <w:rPr>
-          <w:sz w:val="28"/>
-          <w:szCs w:val="28"/>
+          <w:highlight w:val="yellow"/>
+        </w:rPr>
+      </w:pPr>
+      <w:r>
+        <w:rPr>
+          <w:sz w:val="28"/>
+          <w:szCs w:val="28"/>
+          <w:highlight w:val="yellow"/>
         </w:rPr>
         <w:t xml:space="preserve">с использованием декларативных функций, стрелочных функций и классов. </w:t>
       </w:r>
@@ -2169,12 +2110,14 @@
         <w:rPr>
           <w:sz w:val="28"/>
           <w:szCs w:val="28"/>
-        </w:rPr>
-      </w:pPr>
-      <w:r>
-        <w:rPr>
-          <w:sz w:val="28"/>
-          <w:szCs w:val="28"/>
+          <w:highlight w:val="yellow"/>
+        </w:rPr>
+      </w:pPr>
+      <w:r>
+        <w:rPr>
+          <w:sz w:val="28"/>
+          <w:szCs w:val="28"/>
+          <w:highlight w:val="yellow"/>
         </w:rPr>
         <w:t xml:space="preserve">Применить </w:t>
       </w:r>
@@ -2182,6 +2125,7 @@
         <w:rPr>
           <w:sz w:val="28"/>
           <w:szCs w:val="28"/>
+          <w:highlight w:val="yellow"/>
           <w:lang w:val="en-US"/>
         </w:rPr>
         <w:t>props</w:t>
@@ -2190,6 +2134,7 @@
         <w:rPr>
           <w:sz w:val="28"/>
           <w:szCs w:val="28"/>
+          <w:highlight w:val="yellow"/>
         </w:rPr>
         <w:t>, значения по умолчанию.</w:t>
       </w:r>
@@ -2197,6 +2142,7 @@
         <w:rPr>
           <w:sz w:val="28"/>
           <w:szCs w:val="28"/>
+          <w:highlight w:val="yellow"/>
         </w:rPr>
         <w:t xml:space="preserve"> </w:t>
       </w:r>
@@ -2244,7 +2190,7 @@
         </w:rPr>
         <w:t xml:space="preserve">Добавить обработчики событий (минимум семь) – в функциональных компонентах, компонентах классах, с передачей параметров в обработчик события. </w:t>
       </w:r>
-      <w:hyperlink r:id="rId22" w:history="1">
+      <w:hyperlink r:id="rId26" w:history="1">
         <w:r>
           <w:rPr>
             <w:rStyle w:val="a6"/>
@@ -2302,7 +2248,7 @@
         </w:rPr>
         <w:t xml:space="preserve"> (</w:t>
       </w:r>
-      <w:hyperlink r:id="rId23" w:history="1">
+      <w:hyperlink r:id="rId27" w:history="1">
         <w:r>
           <w:rPr>
             <w:rStyle w:val="a6"/>
@@ -2530,7 +2476,7 @@
         </w:rPr>
         <w:t xml:space="preserve"> </w:t>
       </w:r>
-      <w:hyperlink r:id="rId24" w:history="1">
+      <w:hyperlink r:id="rId28" w:history="1">
         <w:r>
           <w:rPr>
             <w:rStyle w:val="a6"/>
@@ -2600,8 +2546,6 @@
           <w:highlight w:val="yellow"/>
         </w:rPr>
       </w:pPr>
-      <w:bookmarkStart w:id="0" w:name="_GoBack"/>
-      <w:bookmarkEnd w:id="0"/>
       <w:r>
         <w:rPr>
           <w:sz w:val="28"/>

</xml_diff>